<commit_message>
Add new screenshots for LAN allocation and VLSM tree
- Added "LAN Allocation and WAN-2026-08-29-212534.png" to document the LAN allocation setup.
- Added "VLSM Tree.png" to illustrate the Variable Length Subnet Masking (VLSM) structure.
</commit_message>
<xml_diff>
--- a/Documentations/CSE421_Lab_Project_report (Edit this).docx
+++ b/Documentations/CSE421_Lab_Project_report (Edit this).docx
@@ -345,6 +345,156 @@
       <w:pPr>
         <w:pStyle w:val="Normal"/>
         <w:bidi w:val="0"/>
+        <w:jc w:val="start"/>
+        <w:rPr>
+          <w:rFonts w:ascii="Arial" w:hAnsi="Arial"/>
+        </w:rPr>
+      </w:pPr>
+      <w:r>
+        <w:rPr>
+          <w:rFonts w:ascii="Arial" w:hAnsi="Arial"/>
+        </w:rPr>
+      </w:r>
+    </w:p>
+    <w:p>
+      <w:pPr>
+        <w:pStyle w:val="Normal"/>
+        <w:bidi w:val="0"/>
+        <w:jc w:val="start"/>
+        <w:rPr>
+          <w:rFonts w:ascii="Arial" w:hAnsi="Arial"/>
+        </w:rPr>
+      </w:pPr>
+      <w:r>
+        <w:rPr>
+          <w:rFonts w:ascii="Arial" w:hAnsi="Arial"/>
+        </w:rPr>
+      </w:r>
+    </w:p>
+    <w:p>
+      <w:pPr>
+        <w:pStyle w:val="Normal"/>
+        <w:bidi w:val="0"/>
+        <w:jc w:val="start"/>
+        <w:rPr>
+          <w:rFonts w:ascii="Arial" w:hAnsi="Arial"/>
+        </w:rPr>
+      </w:pPr>
+      <w:r>
+        <w:rPr>
+          <w:rFonts w:ascii="Arial" w:hAnsi="Arial"/>
+        </w:rPr>
+      </w:r>
+    </w:p>
+    <w:p>
+      <w:pPr>
+        <w:pStyle w:val="Normal"/>
+        <w:bidi w:val="0"/>
+        <w:jc w:val="start"/>
+        <w:rPr>
+          <w:rFonts w:ascii="Arial" w:hAnsi="Arial"/>
+        </w:rPr>
+      </w:pPr>
+      <w:r>
+        <w:rPr>
+          <w:rFonts w:ascii="Arial" w:hAnsi="Arial"/>
+        </w:rPr>
+      </w:r>
+    </w:p>
+    <w:p>
+      <w:pPr>
+        <w:pStyle w:val="Normal"/>
+        <w:bidi w:val="0"/>
+        <w:jc w:val="start"/>
+        <w:rPr>
+          <w:rFonts w:ascii="Arial" w:hAnsi="Arial"/>
+        </w:rPr>
+      </w:pPr>
+      <w:r>
+        <w:rPr>
+          <w:rFonts w:ascii="Arial" w:hAnsi="Arial"/>
+        </w:rPr>
+      </w:r>
+    </w:p>
+    <w:p>
+      <w:pPr>
+        <w:pStyle w:val="Normal"/>
+        <w:bidi w:val="0"/>
+        <w:jc w:val="start"/>
+        <w:rPr>
+          <w:rFonts w:ascii="Arial" w:hAnsi="Arial"/>
+        </w:rPr>
+      </w:pPr>
+      <w:r>
+        <w:rPr>
+          <w:rFonts w:ascii="Arial" w:hAnsi="Arial"/>
+        </w:rPr>
+      </w:r>
+    </w:p>
+    <w:p>
+      <w:pPr>
+        <w:pStyle w:val="Normal"/>
+        <w:bidi w:val="0"/>
+        <w:jc w:val="start"/>
+        <w:rPr>
+          <w:rFonts w:ascii="Arial" w:hAnsi="Arial"/>
+        </w:rPr>
+      </w:pPr>
+      <w:r>
+        <w:rPr>
+          <w:rFonts w:ascii="Arial" w:hAnsi="Arial"/>
+        </w:rPr>
+      </w:r>
+    </w:p>
+    <w:p>
+      <w:pPr>
+        <w:pStyle w:val="Normal"/>
+        <w:bidi w:val="0"/>
+        <w:jc w:val="start"/>
+        <w:rPr>
+          <w:rFonts w:ascii="Arial" w:hAnsi="Arial"/>
+        </w:rPr>
+      </w:pPr>
+      <w:r>
+        <w:rPr>
+          <w:rFonts w:ascii="Arial" w:hAnsi="Arial"/>
+        </w:rPr>
+      </w:r>
+    </w:p>
+    <w:p>
+      <w:pPr>
+        <w:pStyle w:val="Normal"/>
+        <w:bidi w:val="0"/>
+        <w:jc w:val="start"/>
+        <w:rPr>
+          <w:rFonts w:ascii="Arial" w:hAnsi="Arial"/>
+        </w:rPr>
+      </w:pPr>
+      <w:r>
+        <w:rPr>
+          <w:rFonts w:ascii="Arial" w:hAnsi="Arial"/>
+        </w:rPr>
+      </w:r>
+    </w:p>
+    <w:p>
+      <w:pPr>
+        <w:pStyle w:val="Normal"/>
+        <w:bidi w:val="0"/>
+        <w:jc w:val="start"/>
+        <w:rPr>
+          <w:rFonts w:ascii="Arial" w:hAnsi="Arial"/>
+        </w:rPr>
+      </w:pPr>
+      <w:r>
+        <w:rPr>
+          <w:rFonts w:ascii="Arial" w:hAnsi="Arial"/>
+        </w:rPr>
+      </w:r>
+    </w:p>
+    <w:p>
+      <w:pPr>
+        <w:pStyle w:val="Normal"/>
+        <w:bidi w:val="0"/>
         <w:spacing w:lineRule="auto" w:line="360"/>
         <w:jc w:val="start"/>
         <w:rPr>
@@ -517,162 +667,7 @@
         </w:rPr>
       </w:pPr>
       <w:r>
-        <w:rPr>
-          <w:rFonts w:ascii="Arial" w:hAnsi="Arial"/>
-          <w:b/>
-          <w:bCs/>
-        </w:rPr>
-        <w:t>Instructor Name:</w:t>
-      </w:r>
-    </w:p>
-    <w:p>
-      <w:pPr>
-        <w:pStyle w:val="Normal"/>
-        <w:bidi w:val="0"/>
-        <w:jc w:val="start"/>
-        <w:rPr>
-          <w:rFonts w:ascii="Arial" w:hAnsi="Arial"/>
-        </w:rPr>
-      </w:pPr>
-      <w:r>
-        <w:rPr>
-          <w:rFonts w:ascii="Arial" w:hAnsi="Arial"/>
-        </w:rPr>
-      </w:r>
-    </w:p>
-    <w:p>
-      <w:pPr>
-        <w:pStyle w:val="Normal"/>
-        <w:bidi w:val="0"/>
-        <w:jc w:val="start"/>
-        <w:rPr>
-          <w:rFonts w:ascii="Arial" w:hAnsi="Arial"/>
-        </w:rPr>
-      </w:pPr>
-      <w:r>
-        <w:rPr>
-          <w:rFonts w:ascii="Arial" w:hAnsi="Arial"/>
-        </w:rPr>
-      </w:r>
-    </w:p>
-    <w:p>
-      <w:pPr>
-        <w:pStyle w:val="Normal"/>
-        <w:bidi w:val="0"/>
-        <w:jc w:val="start"/>
-        <w:rPr>
-          <w:rFonts w:ascii="Arial" w:hAnsi="Arial"/>
-        </w:rPr>
-      </w:pPr>
-      <w:r>
-        <w:rPr>
-          <w:rFonts w:ascii="Arial" w:hAnsi="Arial"/>
-        </w:rPr>
-      </w:r>
-    </w:p>
-    <w:p>
-      <w:pPr>
-        <w:pStyle w:val="Normal"/>
-        <w:bidi w:val="0"/>
-        <w:jc w:val="start"/>
-        <w:rPr>
-          <w:rFonts w:ascii="Arial" w:hAnsi="Arial"/>
-        </w:rPr>
-      </w:pPr>
-      <w:r>
-        <w:rPr>
-          <w:rFonts w:ascii="Arial" w:hAnsi="Arial"/>
-        </w:rPr>
-      </w:r>
-    </w:p>
-    <w:p>
-      <w:pPr>
-        <w:pStyle w:val="Normal"/>
-        <w:bidi w:val="0"/>
-        <w:jc w:val="start"/>
-        <w:rPr>
-          <w:rFonts w:ascii="Arial" w:hAnsi="Arial"/>
-        </w:rPr>
-      </w:pPr>
-      <w:r>
-        <w:rPr>
-          <w:rFonts w:ascii="Arial" w:hAnsi="Arial"/>
-        </w:rPr>
-      </w:r>
-    </w:p>
-    <w:p>
-      <w:pPr>
-        <w:pStyle w:val="Normal"/>
-        <w:bidi w:val="0"/>
-        <w:jc w:val="start"/>
-        <w:rPr>
-          <w:rFonts w:ascii="Arial" w:hAnsi="Arial"/>
-        </w:rPr>
-      </w:pPr>
-      <w:r>
-        <w:rPr>
-          <w:rFonts w:ascii="Arial" w:hAnsi="Arial"/>
-        </w:rPr>
-      </w:r>
-    </w:p>
-    <w:p>
-      <w:pPr>
-        <w:pStyle w:val="Normal"/>
-        <w:bidi w:val="0"/>
-        <w:jc w:val="start"/>
-        <w:rPr>
-          <w:rFonts w:ascii="Arial" w:hAnsi="Arial"/>
-        </w:rPr>
-      </w:pPr>
-      <w:r>
-        <w:rPr>
-          <w:rFonts w:ascii="Arial" w:hAnsi="Arial"/>
-        </w:rPr>
-      </w:r>
-    </w:p>
-    <w:p>
-      <w:pPr>
-        <w:pStyle w:val="Normal"/>
-        <w:bidi w:val="0"/>
-        <w:jc w:val="start"/>
-        <w:rPr>
-          <w:rFonts w:ascii="Arial" w:hAnsi="Arial"/>
-        </w:rPr>
-      </w:pPr>
-      <w:r>
-        <w:rPr>
-          <w:rFonts w:ascii="Arial" w:hAnsi="Arial"/>
-        </w:rPr>
-      </w:r>
-    </w:p>
-    <w:p>
-      <w:pPr>
-        <w:pStyle w:val="Normal"/>
-        <w:bidi w:val="0"/>
-        <w:jc w:val="start"/>
-        <w:rPr>
-          <w:rFonts w:ascii="Arial" w:hAnsi="Arial"/>
-        </w:rPr>
-      </w:pPr>
-      <w:r>
-        <w:rPr>
-          <w:rFonts w:ascii="Arial" w:hAnsi="Arial"/>
-        </w:rPr>
-      </w:r>
-    </w:p>
-    <w:p>
-      <w:pPr>
-        <w:pStyle w:val="Normal"/>
-        <w:bidi w:val="0"/>
-        <w:jc w:val="start"/>
-        <w:rPr>
-          <w:rFonts w:ascii="Arial" w:hAnsi="Arial"/>
-        </w:rPr>
-      </w:pPr>
-      <w:r>
-        <w:rPr>
-          <w:rFonts w:ascii="Arial" w:hAnsi="Arial"/>
-        </w:rPr>
+        <w:rPr/>
       </w:r>
     </w:p>
     <w:p>
@@ -732,8 +727,77 @@
       <w:r>
         <w:rPr>
           <w:rFonts w:ascii="Arial" w:hAnsi="Arial"/>
+          <w:b/>
+          <w:bCs/>
         </w:rPr>
-        <w:t> </w:t>
+        <w:t>Topology</w:t>
+      </w:r>
+      <w:r>
+        <w:rPr>
+          <w:rFonts w:ascii="Arial" w:hAnsi="Arial"/>
+        </w:rPr>
+        <w:t>:</w:t>
+      </w:r>
+    </w:p>
+    <w:p>
+      <w:pPr>
+        <w:pStyle w:val="BodyText"/>
+        <w:bidi w:val="0"/>
+        <w:jc w:val="start"/>
+        <w:rPr>
+          <w:rFonts w:ascii="Arial" w:hAnsi="Arial"/>
+        </w:rPr>
+      </w:pPr>
+      <w:r>
+        <w:rPr>
+          <w:rFonts w:ascii="Arial" w:hAnsi="Arial"/>
+        </w:rPr>
+        <w:drawing>
+          <wp:anchor distT="0" distB="0" distL="0" distR="0" simplePos="0" relativeHeight="5" behindDoc="0" locked="0" layoutInCell="0" allowOverlap="1">
+            <wp:simplePos x="0" y="0"/>
+            <wp:positionH relativeFrom="column">
+              <wp:align>center</wp:align>
+            </wp:positionH>
+            <wp:positionV relativeFrom="paragraph">
+              <wp:posOffset>635</wp:posOffset>
+            </wp:positionV>
+            <wp:extent cx="6332220" cy="3559810"/>
+            <wp:effectExtent l="0" t="0" r="0" b="0"/>
+            <wp:wrapSquare wrapText="largest"/>
+            <wp:docPr id="3" name="Image2"/>
+            <wp:cNvGraphicFramePr>
+              <a:graphicFrameLocks xmlns:a="http://schemas.openxmlformats.org/drawingml/2006/main" noChangeAspect="1"/>
+            </wp:cNvGraphicFramePr>
+            <a:graphic xmlns:a="http://schemas.openxmlformats.org/drawingml/2006/main">
+              <a:graphicData uri="http://schemas.openxmlformats.org/drawingml/2006/picture">
+                <pic:pic xmlns:pic="http://schemas.openxmlformats.org/drawingml/2006/picture">
+                  <pic:nvPicPr>
+                    <pic:cNvPr id="3" name="Image2"/>
+                    <pic:cNvPicPr>
+                      <a:picLocks noChangeAspect="1" noChangeArrowheads="1"/>
+                    </pic:cNvPicPr>
+                  </pic:nvPicPr>
+                  <pic:blipFill>
+                    <a:blip r:embed="rId3"/>
+                    <a:stretch>
+                      <a:fillRect/>
+                    </a:stretch>
+                  </pic:blipFill>
+                  <pic:spPr bwMode="auto">
+                    <a:xfrm>
+                      <a:off x="0" y="0"/>
+                      <a:ext cx="6332220" cy="3559810"/>
+                    </a:xfrm>
+                    <a:prstGeom prst="rect">
+                      <a:avLst/>
+                    </a:prstGeom>
+                    <a:noFill/>
+                  </pic:spPr>
+                </pic:pic>
+              </a:graphicData>
+            </a:graphic>
+          </wp:anchor>
+        </w:drawing>
       </w:r>
     </w:p>
     <w:p>
@@ -762,30 +826,33 @@
       <w:r>
         <w:rPr>
           <w:rFonts w:ascii="Arial" w:hAnsi="Arial"/>
+          <w:b/>
+          <w:bCs/>
           <w:lang w:val="en-US"/>
         </w:rPr>
-        <w:t>VLSM Tree:</w:t>
+        <w:t>VLSM Tree</w:t>
       </w:r>
-    </w:p>
-    <w:p>
-      <w:pPr>
-        <w:pStyle w:val="BodyText"/>
-        <w:ind w:hanging="0" w:start="0" w:end="0"/>
-        <w:rPr>
-          <w:rFonts w:ascii="Arial" w:hAnsi="Arial"/>
-        </w:rPr>
-      </w:pPr>
       <w:r>
         <w:rPr>
           <w:rFonts w:ascii="Arial" w:hAnsi="Arial"/>
           <w:lang w:val="en-US"/>
         </w:rPr>
-        <w:tab/>
+        <w:t xml:space="preserve">: </w:t>
+      </w:r>
+      <w:r>
+        <w:rPr>
+          <w:rFonts w:ascii="Arial" w:hAnsi="Arial"/>
+          <w:i/>
+          <w:iCs/>
+          <w:lang w:val="en-US"/>
+        </w:rPr>
         <w:t>Base network – 69.44.0.0/16</w:t>
       </w:r>
       <w:r>
         <w:rPr>
           <w:rFonts w:ascii="Arial" w:hAnsi="Arial"/>
+          <w:i/>
+          <w:iCs/>
         </w:rPr>
         <w:t> </w:t>
       </w:r>
@@ -848,7 +915,7 @@
       <w:tblPr>
         <w:tblW w:w="9930" w:type="dxa"/>
         <w:jc w:val="start"/>
-        <w:tblInd w:w="-7" w:type="dxa"/>
+        <w:tblInd w:w="-6" w:type="dxa"/>
         <w:tblLayout w:type="fixed"/>
         <w:tblCellMar>
           <w:top w:w="28" w:type="dxa"/>
@@ -858,10 +925,10 @@
         </w:tblCellMar>
       </w:tblPr>
       <w:tblGrid>
-        <w:gridCol w:w="1565"/>
+        <w:gridCol w:w="1564"/>
         <w:gridCol w:w="865"/>
         <w:gridCol w:w="1439"/>
-        <w:gridCol w:w="785"/>
+        <w:gridCol w:w="786"/>
         <w:gridCol w:w="1973"/>
         <w:gridCol w:w="1859"/>
         <w:gridCol w:w="1444"/>
@@ -870,13 +937,14 @@
         <w:trPr/>
         <w:tc>
           <w:tcPr>
-            <w:tcW w:w="1565" w:type="dxa"/>
+            <w:tcW w:w="1564" w:type="dxa"/>
             <w:tcBorders>
               <w:top w:val="double" w:sz="2" w:space="0" w:color="808080"/>
               <w:start w:val="double" w:sz="2" w:space="0" w:color="808080"/>
               <w:bottom w:val="double" w:sz="2" w:space="0" w:color="808080"/>
               <w:end w:val="double" w:sz="2" w:space="0" w:color="808080"/>
             </w:tcBorders>
+            <w:shd w:fill="729FCF" w:val="clear"/>
             <w:vAlign w:val="center"/>
           </w:tcPr>
           <w:p>
@@ -887,74 +955,172 @@
               <w:ind w:hanging="0" w:start="0" w:end="0"/>
               <w:jc w:val="center"/>
               <w:rPr>
-                <w:rFonts w:ascii="Arial" w:hAnsi="Arial"/>
+                <w:b/>
+                <w:bCs/>
+                <w:i w:val="false"/>
+                <w:iCs w:val="false"/>
+              </w:rPr>
+            </w:pPr>
+            <w:r>
+              <w:rPr>
+                <w:rFonts w:ascii="Arial" w:hAnsi="Arial"/>
+                <w:b/>
+                <w:bCs/>
+                <w:i w:val="false"/>
+                <w:iCs w:val="false"/>
                 <w:sz w:val="20"/>
                 <w:szCs w:val="20"/>
-              </w:rPr>
-            </w:pPr>
-            <w:r>
-              <w:rPr>
-                <w:rFonts w:ascii="Arial" w:hAnsi="Arial"/>
+                <w:lang w:val="en-US"/>
+              </w:rPr>
+              <w:t>LINK</w:t>
+            </w:r>
+          </w:p>
+        </w:tc>
+        <w:tc>
+          <w:tcPr>
+            <w:tcW w:w="865" w:type="dxa"/>
+            <w:tcBorders>
+              <w:top w:val="double" w:sz="2" w:space="0" w:color="808080"/>
+              <w:start w:val="double" w:sz="2" w:space="0" w:color="808080"/>
+              <w:bottom w:val="double" w:sz="2" w:space="0" w:color="808080"/>
+              <w:end w:val="double" w:sz="2" w:space="0" w:color="808080"/>
+            </w:tcBorders>
+            <w:shd w:fill="729FCF" w:val="clear"/>
+            <w:vAlign w:val="center"/>
+          </w:tcPr>
+          <w:p>
+            <w:pPr>
+              <w:pStyle w:val="TableContents"/>
+              <w:widowControl/>
+              <w:spacing w:before="0" w:after="283"/>
+              <w:ind w:hanging="0" w:start="0" w:end="0"/>
+              <w:jc w:val="center"/>
+              <w:rPr>
+                <w:b/>
+                <w:bCs/>
+                <w:i w:val="false"/>
+                <w:iCs w:val="false"/>
+              </w:rPr>
+            </w:pPr>
+            <w:r>
+              <w:rPr>
+                <w:rFonts w:ascii="Arial" w:hAnsi="Arial"/>
+                <w:b/>
+                <w:bCs/>
+                <w:i w:val="false"/>
+                <w:iCs w:val="false"/>
                 <w:sz w:val="20"/>
                 <w:szCs w:val="20"/>
-                <w:lang w:val="en-US"/>
-              </w:rPr>
-              <w:t>LINK</w:t>
-            </w:r>
-          </w:p>
-        </w:tc>
-        <w:tc>
-          <w:tcPr>
-            <w:tcW w:w="865" w:type="dxa"/>
-            <w:tcBorders>
-              <w:top w:val="double" w:sz="2" w:space="0" w:color="808080"/>
-              <w:start w:val="double" w:sz="2" w:space="0" w:color="808080"/>
-              <w:bottom w:val="double" w:sz="2" w:space="0" w:color="808080"/>
-              <w:end w:val="double" w:sz="2" w:space="0" w:color="808080"/>
-            </w:tcBorders>
-            <w:vAlign w:val="center"/>
-          </w:tcPr>
-          <w:p>
-            <w:pPr>
-              <w:pStyle w:val="TableContents"/>
-              <w:widowControl/>
-              <w:spacing w:before="0" w:after="283"/>
-              <w:ind w:hanging="0" w:start="0" w:end="0"/>
-              <w:jc w:val="center"/>
-              <w:rPr>
-                <w:rFonts w:ascii="Arial" w:hAnsi="Arial"/>
+              </w:rPr>
+              <w:t xml:space="preserve">    </w:t>
+            </w:r>
+            <w:r>
+              <w:rPr>
+                <w:rFonts w:ascii="Arial" w:hAnsi="Arial"/>
+                <w:b/>
+                <w:bCs/>
+                <w:i w:val="false"/>
+                <w:iCs w:val="false"/>
                 <w:sz w:val="20"/>
                 <w:szCs w:val="20"/>
-              </w:rPr>
-            </w:pPr>
-            <w:r>
-              <w:rPr>
-                <w:rFonts w:ascii="Arial" w:hAnsi="Arial"/>
+                <w:lang w:val="en-US"/>
+              </w:rPr>
+              <w:t>Hosts</w:t>
+            </w:r>
+          </w:p>
+        </w:tc>
+        <w:tc>
+          <w:tcPr>
+            <w:tcW w:w="1439" w:type="dxa"/>
+            <w:tcBorders>
+              <w:top w:val="double" w:sz="2" w:space="0" w:color="808080"/>
+              <w:start w:val="double" w:sz="2" w:space="0" w:color="808080"/>
+              <w:bottom w:val="double" w:sz="2" w:space="0" w:color="808080"/>
+              <w:end w:val="double" w:sz="2" w:space="0" w:color="808080"/>
+            </w:tcBorders>
+            <w:shd w:fill="729FCF" w:val="clear"/>
+            <w:vAlign w:val="center"/>
+          </w:tcPr>
+          <w:p>
+            <w:pPr>
+              <w:pStyle w:val="TableContents"/>
+              <w:widowControl/>
+              <w:spacing w:before="0" w:after="283"/>
+              <w:ind w:hanging="0" w:start="0" w:end="0"/>
+              <w:jc w:val="center"/>
+              <w:rPr>
+                <w:b/>
+                <w:bCs/>
+                <w:i w:val="false"/>
+                <w:iCs w:val="false"/>
+              </w:rPr>
+            </w:pPr>
+            <w:r>
+              <w:rPr>
+                <w:rFonts w:ascii="Arial" w:hAnsi="Arial"/>
+                <w:b/>
+                <w:bCs/>
+                <w:i w:val="false"/>
+                <w:iCs w:val="false"/>
                 <w:sz w:val="20"/>
                 <w:szCs w:val="20"/>
-              </w:rPr>
-              <w:t xml:space="preserve">    </w:t>
-            </w:r>
-            <w:r>
-              <w:rPr>
-                <w:rFonts w:ascii="Arial" w:hAnsi="Arial"/>
+                <w:lang w:val="en-US"/>
+              </w:rPr>
+              <w:t>Network</w:t>
+            </w:r>
+          </w:p>
+        </w:tc>
+        <w:tc>
+          <w:tcPr>
+            <w:tcW w:w="786" w:type="dxa"/>
+            <w:tcBorders>
+              <w:top w:val="double" w:sz="2" w:space="0" w:color="808080"/>
+              <w:start w:val="double" w:sz="2" w:space="0" w:color="808080"/>
+              <w:bottom w:val="double" w:sz="2" w:space="0" w:color="808080"/>
+              <w:end w:val="double" w:sz="2" w:space="0" w:color="808080"/>
+            </w:tcBorders>
+            <w:shd w:fill="729FCF" w:val="clear"/>
+            <w:vAlign w:val="center"/>
+          </w:tcPr>
+          <w:p>
+            <w:pPr>
+              <w:pStyle w:val="TableContents"/>
+              <w:widowControl/>
+              <w:spacing w:before="0" w:after="283"/>
+              <w:ind w:hanging="0" w:start="0" w:end="0"/>
+              <w:jc w:val="center"/>
+              <w:rPr>
+                <w:b/>
+                <w:bCs/>
+                <w:i w:val="false"/>
+                <w:iCs w:val="false"/>
+              </w:rPr>
+            </w:pPr>
+            <w:r>
+              <w:rPr>
+                <w:rFonts w:ascii="Arial" w:hAnsi="Arial"/>
+                <w:b/>
+                <w:bCs/>
+                <w:i w:val="false"/>
+                <w:iCs w:val="false"/>
                 <w:sz w:val="20"/>
                 <w:szCs w:val="20"/>
                 <w:lang w:val="en-US"/>
               </w:rPr>
-              <w:t>Hosts</w:t>
-            </w:r>
-          </w:p>
-        </w:tc>
-        <w:tc>
-          <w:tcPr>
-            <w:tcW w:w="1439" w:type="dxa"/>
+              <w:t>Prefix</w:t>
+            </w:r>
+          </w:p>
+        </w:tc>
+        <w:tc>
+          <w:tcPr>
+            <w:tcW w:w="1973" w:type="dxa"/>
             <w:tcBorders>
               <w:top w:val="double" w:sz="2" w:space="0" w:color="808080"/>
               <w:start w:val="double" w:sz="2" w:space="0" w:color="808080"/>
               <w:bottom w:val="double" w:sz="2" w:space="0" w:color="808080"/>
               <w:end w:val="double" w:sz="2" w:space="0" w:color="808080"/>
             </w:tcBorders>
+            <w:shd w:fill="729FCF" w:val="clear"/>
             <w:vAlign w:val="center"/>
           </w:tcPr>
           <w:p>
@@ -965,31 +1131,78 @@
               <w:ind w:hanging="0" w:start="0" w:end="0"/>
               <w:jc w:val="center"/>
               <w:rPr>
-                <w:rFonts w:ascii="Arial" w:hAnsi="Arial"/>
+                <w:b/>
+                <w:bCs/>
+                <w:i w:val="false"/>
+                <w:iCs w:val="false"/>
+              </w:rPr>
+            </w:pPr>
+            <w:r>
+              <w:rPr>
+                <w:rFonts w:ascii="Arial" w:hAnsi="Arial"/>
+                <w:b/>
+                <w:bCs/>
+                <w:i w:val="false"/>
+                <w:iCs w:val="false"/>
                 <w:sz w:val="20"/>
                 <w:szCs w:val="20"/>
-              </w:rPr>
-            </w:pPr>
-            <w:r>
-              <w:rPr>
-                <w:rFonts w:ascii="Arial" w:hAnsi="Arial"/>
+                <w:lang w:val="en-US"/>
+              </w:rPr>
+              <w:t>Mask</w:t>
+            </w:r>
+          </w:p>
+        </w:tc>
+        <w:tc>
+          <w:tcPr>
+            <w:tcW w:w="1859" w:type="dxa"/>
+            <w:tcBorders>
+              <w:top w:val="double" w:sz="2" w:space="0" w:color="808080"/>
+              <w:start w:val="double" w:sz="2" w:space="0" w:color="808080"/>
+              <w:bottom w:val="double" w:sz="2" w:space="0" w:color="808080"/>
+              <w:end w:val="double" w:sz="2" w:space="0" w:color="808080"/>
+            </w:tcBorders>
+            <w:shd w:fill="729FCF" w:val="clear"/>
+            <w:vAlign w:val="center"/>
+          </w:tcPr>
+          <w:p>
+            <w:pPr>
+              <w:pStyle w:val="TableContents"/>
+              <w:widowControl/>
+              <w:spacing w:before="0" w:after="283"/>
+              <w:ind w:hanging="0" w:start="0" w:end="0"/>
+              <w:jc w:val="center"/>
+              <w:rPr>
+                <w:b/>
+                <w:bCs/>
+                <w:i w:val="false"/>
+                <w:iCs w:val="false"/>
+              </w:rPr>
+            </w:pPr>
+            <w:r>
+              <w:rPr>
+                <w:rFonts w:ascii="Arial" w:hAnsi="Arial"/>
+                <w:b/>
+                <w:bCs/>
+                <w:i w:val="false"/>
+                <w:iCs w:val="false"/>
                 <w:sz w:val="20"/>
                 <w:szCs w:val="20"/>
                 <w:lang w:val="en-US"/>
               </w:rPr>
-              <w:t>Network</w:t>
-            </w:r>
-          </w:p>
-        </w:tc>
-        <w:tc>
-          <w:tcPr>
-            <w:tcW w:w="785" w:type="dxa"/>
+              <w:t>Usable range</w:t>
+            </w:r>
+          </w:p>
+        </w:tc>
+        <w:tc>
+          <w:tcPr>
+            <w:tcW w:w="1444" w:type="dxa"/>
             <w:tcBorders>
               <w:top w:val="double" w:sz="2" w:space="0" w:color="808080"/>
               <w:start w:val="double" w:sz="2" w:space="0" w:color="808080"/>
               <w:bottom w:val="double" w:sz="2" w:space="0" w:color="808080"/>
               <w:end w:val="double" w:sz="2" w:space="0" w:color="808080"/>
             </w:tcBorders>
+            <w:shd w:fill="729FCF" w:val="clear"/>
             <w:vAlign w:val="center"/>
           </w:tcPr>
           <w:p>
@@ -1000,128 +1213,19 @@
               <w:ind w:hanging="0" w:start="0" w:end="0"/>
               <w:jc w:val="center"/>
               <w:rPr>
-                <w:rFonts w:ascii="Arial" w:hAnsi="Arial"/>
-                <w:sz w:val="20"/>
-                <w:szCs w:val="20"/>
-              </w:rPr>
-            </w:pPr>
-            <w:r>
-              <w:rPr>
-                <w:rFonts w:ascii="Arial" w:hAnsi="Arial"/>
-                <w:sz w:val="20"/>
-                <w:szCs w:val="20"/>
-                <w:lang w:val="en-US"/>
-              </w:rPr>
-              <w:t>Prefix</w:t>
-            </w:r>
-          </w:p>
-        </w:tc>
-        <w:tc>
-          <w:tcPr>
-            <w:tcW w:w="1973" w:type="dxa"/>
-            <w:tcBorders>
-              <w:top w:val="double" w:sz="2" w:space="0" w:color="808080"/>
-              <w:start w:val="double" w:sz="2" w:space="0" w:color="808080"/>
-              <w:bottom w:val="double" w:sz="2" w:space="0" w:color="808080"/>
-              <w:end w:val="double" w:sz="2" w:space="0" w:color="808080"/>
-            </w:tcBorders>
-            <w:vAlign w:val="center"/>
-          </w:tcPr>
-          <w:p>
-            <w:pPr>
-              <w:pStyle w:val="TableContents"/>
-              <w:widowControl/>
-              <w:spacing w:before="0" w:after="283"/>
-              <w:ind w:hanging="0" w:start="0" w:end="0"/>
-              <w:jc w:val="center"/>
-              <w:rPr>
-                <w:rFonts w:ascii="Arial" w:hAnsi="Arial"/>
-                <w:sz w:val="20"/>
-                <w:szCs w:val="20"/>
-              </w:rPr>
-            </w:pPr>
-            <w:r>
-              <w:rPr>
-                <w:rFonts w:ascii="Arial" w:hAnsi="Arial"/>
-                <w:sz w:val="20"/>
-                <w:szCs w:val="20"/>
-                <w:lang w:val="en-US"/>
-              </w:rPr>
-              <w:t>Mas</w:t>
-            </w:r>
-            <w:r>
-              <w:rPr>
-                <w:rFonts w:ascii="Arial" w:hAnsi="Arial"/>
-                <w:sz w:val="20"/>
-                <w:szCs w:val="20"/>
-                <w:lang w:val="en-US"/>
-              </w:rPr>
-              <w:t>k</w:t>
-            </w:r>
-          </w:p>
-        </w:tc>
-        <w:tc>
-          <w:tcPr>
-            <w:tcW w:w="1859" w:type="dxa"/>
-            <w:tcBorders>
-              <w:top w:val="double" w:sz="2" w:space="0" w:color="808080"/>
-              <w:start w:val="double" w:sz="2" w:space="0" w:color="808080"/>
-              <w:bottom w:val="double" w:sz="2" w:space="0" w:color="808080"/>
-              <w:end w:val="double" w:sz="2" w:space="0" w:color="808080"/>
-            </w:tcBorders>
-            <w:vAlign w:val="center"/>
-          </w:tcPr>
-          <w:p>
-            <w:pPr>
-              <w:pStyle w:val="TableContents"/>
-              <w:widowControl/>
-              <w:spacing w:before="0" w:after="283"/>
-              <w:ind w:hanging="0" w:start="0" w:end="0"/>
-              <w:jc w:val="center"/>
-              <w:rPr>
-                <w:rFonts w:ascii="Arial" w:hAnsi="Arial"/>
-                <w:sz w:val="20"/>
-                <w:szCs w:val="20"/>
-              </w:rPr>
-            </w:pPr>
-            <w:r>
-              <w:rPr>
-                <w:rFonts w:ascii="Arial" w:hAnsi="Arial"/>
-                <w:sz w:val="20"/>
-                <w:szCs w:val="20"/>
-                <w:lang w:val="en-US"/>
-              </w:rPr>
-              <w:t>Usable range</w:t>
-            </w:r>
-          </w:p>
-        </w:tc>
-        <w:tc>
-          <w:tcPr>
-            <w:tcW w:w="1444" w:type="dxa"/>
-            <w:tcBorders>
-              <w:top w:val="double" w:sz="2" w:space="0" w:color="808080"/>
-              <w:start w:val="double" w:sz="2" w:space="0" w:color="808080"/>
-              <w:bottom w:val="double" w:sz="2" w:space="0" w:color="808080"/>
-              <w:end w:val="double" w:sz="2" w:space="0" w:color="808080"/>
-            </w:tcBorders>
-            <w:vAlign w:val="center"/>
-          </w:tcPr>
-          <w:p>
-            <w:pPr>
-              <w:pStyle w:val="TableContents"/>
-              <w:widowControl/>
-              <w:spacing w:before="0" w:after="283"/>
-              <w:ind w:hanging="0" w:start="0" w:end="0"/>
-              <w:jc w:val="center"/>
-              <w:rPr>
-                <w:rFonts w:ascii="Arial" w:hAnsi="Arial"/>
-                <w:sz w:val="20"/>
-                <w:szCs w:val="20"/>
-              </w:rPr>
-            </w:pPr>
-            <w:r>
-              <w:rPr>
-                <w:rFonts w:ascii="Arial" w:hAnsi="Arial"/>
+                <w:b/>
+                <w:bCs/>
+                <w:i w:val="false"/>
+                <w:iCs w:val="false"/>
+              </w:rPr>
+            </w:pPr>
+            <w:r>
+              <w:rPr>
+                <w:rFonts w:ascii="Arial" w:hAnsi="Arial"/>
+                <w:b/>
+                <w:bCs/>
+                <w:i w:val="false"/>
+                <w:iCs w:val="false"/>
                 <w:sz w:val="20"/>
                 <w:szCs w:val="20"/>
                 <w:lang w:val="en-US"/>
@@ -1135,7 +1239,7 @@
         <w:trPr/>
         <w:tc>
           <w:tcPr>
-            <w:tcW w:w="1565" w:type="dxa"/>
+            <w:tcW w:w="1564" w:type="dxa"/>
             <w:tcBorders>
               <w:start w:val="double" w:sz="2" w:space="0" w:color="808080"/>
               <w:bottom w:val="double" w:sz="2" w:space="0" w:color="808080"/>
@@ -1241,7 +1345,7 @@
         </w:tc>
         <w:tc>
           <w:tcPr>
-            <w:tcW w:w="785" w:type="dxa"/>
+            <w:tcW w:w="786" w:type="dxa"/>
             <w:tcBorders>
               <w:start w:val="double" w:sz="2" w:space="0" w:color="808080"/>
               <w:bottom w:val="double" w:sz="2" w:space="0" w:color="808080"/>
@@ -1384,7 +1488,7 @@
         <w:trPr/>
         <w:tc>
           <w:tcPr>
-            <w:tcW w:w="1565" w:type="dxa"/>
+            <w:tcW w:w="1564" w:type="dxa"/>
             <w:tcBorders>
               <w:start w:val="double" w:sz="2" w:space="0" w:color="808080"/>
               <w:bottom w:val="double" w:sz="2" w:space="0" w:color="808080"/>
@@ -1490,7 +1594,7 @@
         </w:tc>
         <w:tc>
           <w:tcPr>
-            <w:tcW w:w="785" w:type="dxa"/>
+            <w:tcW w:w="786" w:type="dxa"/>
             <w:tcBorders>
               <w:start w:val="double" w:sz="2" w:space="0" w:color="808080"/>
               <w:bottom w:val="double" w:sz="2" w:space="0" w:color="808080"/>
@@ -1633,7 +1737,7 @@
         <w:trPr/>
         <w:tc>
           <w:tcPr>
-            <w:tcW w:w="1565" w:type="dxa"/>
+            <w:tcW w:w="1564" w:type="dxa"/>
             <w:tcBorders>
               <w:start w:val="double" w:sz="2" w:space="0" w:color="808080"/>
               <w:bottom w:val="double" w:sz="2" w:space="0" w:color="808080"/>
@@ -1739,7 +1843,7 @@
         </w:tc>
         <w:tc>
           <w:tcPr>
-            <w:tcW w:w="785" w:type="dxa"/>
+            <w:tcW w:w="786" w:type="dxa"/>
             <w:tcBorders>
               <w:start w:val="double" w:sz="2" w:space="0" w:color="808080"/>
               <w:bottom w:val="double" w:sz="2" w:space="0" w:color="808080"/>
@@ -1868,6 +1972,257 @@
                 <w:lang w:val="en-US"/>
               </w:rPr>
               <w:t>69.44.6.255</w:t>
+            </w:r>
+            <w:r>
+              <w:rPr>
+                <w:rFonts w:ascii="Arial" w:hAnsi="Arial"/>
+              </w:rPr>
+              <w:t> </w:t>
+            </w:r>
+          </w:p>
+        </w:tc>
+      </w:tr>
+      <w:tr>
+        <w:trPr>
+          <w:trHeight w:val="1588" w:hRule="atLeast"/>
+        </w:trPr>
+        <w:tc>
+          <w:tcPr>
+            <w:tcW w:w="1564" w:type="dxa"/>
+            <w:tcBorders>
+              <w:start w:val="double" w:sz="2" w:space="0" w:color="808080"/>
+              <w:bottom w:val="double" w:sz="2" w:space="0" w:color="808080"/>
+              <w:end w:val="double" w:sz="2" w:space="0" w:color="808080"/>
+            </w:tcBorders>
+            <w:vAlign w:val="center"/>
+          </w:tcPr>
+          <w:p>
+            <w:pPr>
+              <w:pStyle w:val="TableContents"/>
+              <w:widowControl/>
+              <w:spacing w:before="0" w:after="283"/>
+              <w:ind w:hanging="0" w:start="0" w:end="0"/>
+              <w:jc w:val="center"/>
+              <w:rPr>
+                <w:rFonts w:ascii="Arial" w:hAnsi="Arial"/>
+              </w:rPr>
+            </w:pPr>
+            <w:r>
+              <w:rPr>
+                <w:rFonts w:ascii="Arial" w:hAnsi="Arial"/>
+                <w:lang w:val="en-US"/>
+              </w:rPr>
+              <w:t>MDU Lan</w:t>
+            </w:r>
+            <w:r>
+              <w:rPr>
+                <w:rFonts w:ascii="Arial" w:hAnsi="Arial"/>
+              </w:rPr>
+              <w:t> </w:t>
+            </w:r>
+          </w:p>
+        </w:tc>
+        <w:tc>
+          <w:tcPr>
+            <w:tcW w:w="865" w:type="dxa"/>
+            <w:tcBorders>
+              <w:start w:val="double" w:sz="2" w:space="0" w:color="808080"/>
+              <w:bottom w:val="double" w:sz="2" w:space="0" w:color="808080"/>
+              <w:end w:val="double" w:sz="2" w:space="0" w:color="808080"/>
+            </w:tcBorders>
+            <w:vAlign w:val="center"/>
+          </w:tcPr>
+          <w:p>
+            <w:pPr>
+              <w:pStyle w:val="TableContents"/>
+              <w:widowControl/>
+              <w:spacing w:before="0" w:after="283"/>
+              <w:ind w:hanging="0" w:start="0" w:end="0"/>
+              <w:rPr>
+                <w:rFonts w:ascii="Arial" w:hAnsi="Arial"/>
+              </w:rPr>
+            </w:pPr>
+            <w:r>
+              <w:rPr>
+                <w:rFonts w:ascii="Arial" w:hAnsi="Arial"/>
+                <w:lang w:val="en-US"/>
+              </w:rPr>
+              <w:t>160</w:t>
+            </w:r>
+            <w:r>
+              <w:rPr>
+                <w:rFonts w:ascii="Arial" w:hAnsi="Arial"/>
+              </w:rPr>
+              <w:t> </w:t>
+            </w:r>
+          </w:p>
+        </w:tc>
+        <w:tc>
+          <w:tcPr>
+            <w:tcW w:w="1439" w:type="dxa"/>
+            <w:tcBorders>
+              <w:start w:val="double" w:sz="2" w:space="0" w:color="808080"/>
+              <w:bottom w:val="double" w:sz="2" w:space="0" w:color="808080"/>
+              <w:end w:val="double" w:sz="2" w:space="0" w:color="808080"/>
+            </w:tcBorders>
+            <w:vAlign w:val="center"/>
+          </w:tcPr>
+          <w:p>
+            <w:pPr>
+              <w:pStyle w:val="TableContents"/>
+              <w:widowControl/>
+              <w:spacing w:before="0" w:after="283"/>
+              <w:ind w:hanging="0" w:start="0" w:end="0"/>
+              <w:rPr>
+                <w:rFonts w:ascii="Arial" w:hAnsi="Arial"/>
+              </w:rPr>
+            </w:pPr>
+            <w:r>
+              <w:rPr>
+                <w:rFonts w:ascii="Arial" w:hAnsi="Arial"/>
+                <w:lang w:val="en-US"/>
+              </w:rPr>
+              <w:t>69.44.7.0</w:t>
+            </w:r>
+            <w:r>
+              <w:rPr>
+                <w:rFonts w:ascii="Arial" w:hAnsi="Arial"/>
+              </w:rPr>
+              <w:t> </w:t>
+            </w:r>
+          </w:p>
+        </w:tc>
+        <w:tc>
+          <w:tcPr>
+            <w:tcW w:w="786" w:type="dxa"/>
+            <w:tcBorders>
+              <w:start w:val="double" w:sz="2" w:space="0" w:color="808080"/>
+              <w:bottom w:val="double" w:sz="2" w:space="0" w:color="808080"/>
+              <w:end w:val="double" w:sz="2" w:space="0" w:color="808080"/>
+            </w:tcBorders>
+            <w:vAlign w:val="center"/>
+          </w:tcPr>
+          <w:p>
+            <w:pPr>
+              <w:pStyle w:val="TableContents"/>
+              <w:widowControl/>
+              <w:spacing w:before="0" w:after="283"/>
+              <w:ind w:hanging="0" w:start="0" w:end="0"/>
+              <w:rPr>
+                <w:rFonts w:ascii="Arial" w:hAnsi="Arial"/>
+              </w:rPr>
+            </w:pPr>
+            <w:r>
+              <w:rPr>
+                <w:rFonts w:ascii="Arial" w:hAnsi="Arial"/>
+                <w:lang w:val="en-US"/>
+              </w:rPr>
+              <w:t>/24</w:t>
+            </w:r>
+            <w:r>
+              <w:rPr>
+                <w:rFonts w:ascii="Arial" w:hAnsi="Arial"/>
+              </w:rPr>
+              <w:t> </w:t>
+            </w:r>
+          </w:p>
+        </w:tc>
+        <w:tc>
+          <w:tcPr>
+            <w:tcW w:w="1973" w:type="dxa"/>
+            <w:tcBorders>
+              <w:start w:val="double" w:sz="2" w:space="0" w:color="808080"/>
+              <w:bottom w:val="double" w:sz="2" w:space="0" w:color="808080"/>
+              <w:end w:val="double" w:sz="2" w:space="0" w:color="808080"/>
+            </w:tcBorders>
+            <w:vAlign w:val="center"/>
+          </w:tcPr>
+          <w:p>
+            <w:pPr>
+              <w:pStyle w:val="TableContents"/>
+              <w:widowControl/>
+              <w:spacing w:before="0" w:after="283"/>
+              <w:ind w:hanging="0" w:start="0" w:end="0"/>
+              <w:rPr>
+                <w:rFonts w:ascii="Arial" w:hAnsi="Arial"/>
+              </w:rPr>
+            </w:pPr>
+            <w:r>
+              <w:rPr>
+                <w:rFonts w:ascii="Arial" w:hAnsi="Arial"/>
+                <w:lang w:val="en-US"/>
+              </w:rPr>
+              <w:t>255.255.255.0</w:t>
+            </w:r>
+            <w:r>
+              <w:rPr>
+                <w:rFonts w:ascii="Arial" w:hAnsi="Arial"/>
+              </w:rPr>
+              <w:t> </w:t>
+            </w:r>
+          </w:p>
+        </w:tc>
+        <w:tc>
+          <w:tcPr>
+            <w:tcW w:w="1859" w:type="dxa"/>
+            <w:tcBorders>
+              <w:start w:val="double" w:sz="2" w:space="0" w:color="808080"/>
+              <w:bottom w:val="double" w:sz="2" w:space="0" w:color="808080"/>
+              <w:end w:val="double" w:sz="2" w:space="0" w:color="808080"/>
+            </w:tcBorders>
+            <w:vAlign w:val="center"/>
+          </w:tcPr>
+          <w:p>
+            <w:pPr>
+              <w:pStyle w:val="TableContents"/>
+              <w:widowControl/>
+              <w:spacing w:before="0" w:after="283"/>
+              <w:ind w:hanging="0" w:start="0" w:end="0"/>
+              <w:rPr>
+                <w:rFonts w:ascii="Arial" w:hAnsi="Arial"/>
+              </w:rPr>
+            </w:pPr>
+            <w:r>
+              <w:rPr>
+                <w:rFonts w:ascii="Arial" w:hAnsi="Arial"/>
+                <w:lang w:val="en-US"/>
+              </w:rPr>
+              <w:t>69.44.7.1-69.44.7.254</w:t>
+            </w:r>
+            <w:r>
+              <w:rPr>
+                <w:rFonts w:ascii="Arial" w:hAnsi="Arial"/>
+              </w:rPr>
+              <w:t> </w:t>
+            </w:r>
+          </w:p>
+        </w:tc>
+        <w:tc>
+          <w:tcPr>
+            <w:tcW w:w="1444" w:type="dxa"/>
+            <w:tcBorders>
+              <w:start w:val="double" w:sz="2" w:space="0" w:color="808080"/>
+              <w:bottom w:val="double" w:sz="2" w:space="0" w:color="808080"/>
+              <w:end w:val="double" w:sz="2" w:space="0" w:color="808080"/>
+            </w:tcBorders>
+            <w:vAlign w:val="center"/>
+          </w:tcPr>
+          <w:p>
+            <w:pPr>
+              <w:pStyle w:val="TableContents"/>
+              <w:widowControl/>
+              <w:spacing w:before="0" w:after="283"/>
+              <w:ind w:hanging="0" w:start="0" w:end="0"/>
+              <w:rPr>
+                <w:rFonts w:ascii="Arial" w:hAnsi="Arial"/>
+              </w:rPr>
+            </w:pPr>
+            <w:r>
+              <w:rPr>
+                <w:rFonts w:ascii="Arial" w:hAnsi="Arial"/>
+                <w:lang w:val="en-US"/>
+              </w:rPr>
+              <w:t>60.44.7.255</w:t>
             </w:r>
             <w:r>
               <w:rPr>
@@ -1882,7 +2237,7 @@
         <w:trPr/>
         <w:tc>
           <w:tcPr>
-            <w:tcW w:w="1565" w:type="dxa"/>
+            <w:tcW w:w="1564" w:type="dxa"/>
             <w:tcBorders>
               <w:start w:val="double" w:sz="2" w:space="0" w:color="808080"/>
               <w:bottom w:val="double" w:sz="2" w:space="0" w:color="808080"/>
@@ -1906,7 +2261,7 @@
                 <w:rFonts w:ascii="Arial" w:hAnsi="Arial"/>
                 <w:lang w:val="en-US"/>
               </w:rPr>
-              <w:t>MDU Lan</w:t>
+              <w:t>GVU Lan</w:t>
             </w:r>
             <w:r>
               <w:rPr>
@@ -1941,7 +2296,7 @@
                 <w:rFonts w:ascii="Arial" w:hAnsi="Arial"/>
                 <w:lang w:val="en-US"/>
               </w:rPr>
-              <w:t>160</w:t>
+              <w:t>90</w:t>
             </w:r>
             <w:r>
               <w:rPr>
@@ -1976,42 +2331,42 @@
                 <w:rFonts w:ascii="Arial" w:hAnsi="Arial"/>
                 <w:lang w:val="en-US"/>
               </w:rPr>
-              <w:t>69.44.7.0</w:t>
-            </w:r>
-            <w:r>
-              <w:rPr>
-                <w:rFonts w:ascii="Arial" w:hAnsi="Arial"/>
-              </w:rPr>
-              <w:t> </w:t>
-            </w:r>
-          </w:p>
-        </w:tc>
-        <w:tc>
-          <w:tcPr>
-            <w:tcW w:w="785" w:type="dxa"/>
-            <w:tcBorders>
-              <w:start w:val="double" w:sz="2" w:space="0" w:color="808080"/>
-              <w:bottom w:val="double" w:sz="2" w:space="0" w:color="808080"/>
-              <w:end w:val="double" w:sz="2" w:space="0" w:color="808080"/>
-            </w:tcBorders>
-            <w:vAlign w:val="center"/>
-          </w:tcPr>
-          <w:p>
-            <w:pPr>
-              <w:pStyle w:val="TableContents"/>
-              <w:widowControl/>
-              <w:spacing w:before="0" w:after="283"/>
-              <w:ind w:hanging="0" w:start="0" w:end="0"/>
-              <w:rPr>
-                <w:rFonts w:ascii="Arial" w:hAnsi="Arial"/>
-              </w:rPr>
-            </w:pPr>
-            <w:r>
-              <w:rPr>
-                <w:rFonts w:ascii="Arial" w:hAnsi="Arial"/>
-                <w:lang w:val="en-US"/>
-              </w:rPr>
-              <w:t>/24</w:t>
+              <w:t>69.44.8.0</w:t>
+            </w:r>
+            <w:r>
+              <w:rPr>
+                <w:rFonts w:ascii="Arial" w:hAnsi="Arial"/>
+              </w:rPr>
+              <w:t> </w:t>
+            </w:r>
+          </w:p>
+        </w:tc>
+        <w:tc>
+          <w:tcPr>
+            <w:tcW w:w="786" w:type="dxa"/>
+            <w:tcBorders>
+              <w:start w:val="double" w:sz="2" w:space="0" w:color="808080"/>
+              <w:bottom w:val="double" w:sz="2" w:space="0" w:color="808080"/>
+              <w:end w:val="double" w:sz="2" w:space="0" w:color="808080"/>
+            </w:tcBorders>
+            <w:vAlign w:val="center"/>
+          </w:tcPr>
+          <w:p>
+            <w:pPr>
+              <w:pStyle w:val="TableContents"/>
+              <w:widowControl/>
+              <w:spacing w:before="0" w:after="283"/>
+              <w:ind w:hanging="0" w:start="0" w:end="0"/>
+              <w:rPr>
+                <w:rFonts w:ascii="Arial" w:hAnsi="Arial"/>
+              </w:rPr>
+            </w:pPr>
+            <w:r>
+              <w:rPr>
+                <w:rFonts w:ascii="Arial" w:hAnsi="Arial"/>
+                <w:lang w:val="en-US"/>
+              </w:rPr>
+              <w:t>/25</w:t>
             </w:r>
             <w:r>
               <w:rPr>
@@ -2046,7 +2401,7 @@
                 <w:rFonts w:ascii="Arial" w:hAnsi="Arial"/>
                 <w:lang w:val="en-US"/>
               </w:rPr>
-              <w:t>255.255.255.0</w:t>
+              <w:t>255.255.255.128</w:t>
             </w:r>
             <w:r>
               <w:rPr>
@@ -2081,7 +2436,7 @@
                 <w:rFonts w:ascii="Arial" w:hAnsi="Arial"/>
                 <w:lang w:val="en-US"/>
               </w:rPr>
-              <w:t>69.44.7.1-69.44.7.254</w:t>
+              <w:t>69.44.8.1-69.44.8.126</w:t>
             </w:r>
             <w:r>
               <w:rPr>
@@ -2116,7 +2471,7 @@
                 <w:rFonts w:ascii="Arial" w:hAnsi="Arial"/>
                 <w:lang w:val="en-US"/>
               </w:rPr>
-              <w:t>60.44.7.255</w:t>
+              <w:t>69.44.8.127</w:t>
             </w:r>
             <w:r>
               <w:rPr>
@@ -2131,7 +2486,7 @@
         <w:trPr/>
         <w:tc>
           <w:tcPr>
-            <w:tcW w:w="1565" w:type="dxa"/>
+            <w:tcW w:w="1564" w:type="dxa"/>
             <w:tcBorders>
               <w:start w:val="double" w:sz="2" w:space="0" w:color="808080"/>
               <w:bottom w:val="double" w:sz="2" w:space="0" w:color="808080"/>
@@ -2155,7 +2510,7 @@
                 <w:rFonts w:ascii="Arial" w:hAnsi="Arial"/>
                 <w:lang w:val="en-US"/>
               </w:rPr>
-              <w:t>GVU Lan</w:t>
+              <w:t>ASN Lan</w:t>
             </w:r>
             <w:r>
               <w:rPr>
@@ -2190,7 +2545,7 @@
                 <w:rFonts w:ascii="Arial" w:hAnsi="Arial"/>
                 <w:lang w:val="en-US"/>
               </w:rPr>
-              <w:t>90</w:t>
+              <w:t>45</w:t>
             </w:r>
             <w:r>
               <w:rPr>
@@ -2225,42 +2580,42 @@
                 <w:rFonts w:ascii="Arial" w:hAnsi="Arial"/>
                 <w:lang w:val="en-US"/>
               </w:rPr>
-              <w:t>69.44.8.0</w:t>
-            </w:r>
-            <w:r>
-              <w:rPr>
-                <w:rFonts w:ascii="Arial" w:hAnsi="Arial"/>
-              </w:rPr>
-              <w:t> </w:t>
-            </w:r>
-          </w:p>
-        </w:tc>
-        <w:tc>
-          <w:tcPr>
-            <w:tcW w:w="785" w:type="dxa"/>
-            <w:tcBorders>
-              <w:start w:val="double" w:sz="2" w:space="0" w:color="808080"/>
-              <w:bottom w:val="double" w:sz="2" w:space="0" w:color="808080"/>
-              <w:end w:val="double" w:sz="2" w:space="0" w:color="808080"/>
-            </w:tcBorders>
-            <w:vAlign w:val="center"/>
-          </w:tcPr>
-          <w:p>
-            <w:pPr>
-              <w:pStyle w:val="TableContents"/>
-              <w:widowControl/>
-              <w:spacing w:before="0" w:after="283"/>
-              <w:ind w:hanging="0" w:start="0" w:end="0"/>
-              <w:rPr>
-                <w:rFonts w:ascii="Arial" w:hAnsi="Arial"/>
-              </w:rPr>
-            </w:pPr>
-            <w:r>
-              <w:rPr>
-                <w:rFonts w:ascii="Arial" w:hAnsi="Arial"/>
-                <w:lang w:val="en-US"/>
-              </w:rPr>
-              <w:t>/25</w:t>
+              <w:t>69.44.8.128</w:t>
+            </w:r>
+            <w:r>
+              <w:rPr>
+                <w:rFonts w:ascii="Arial" w:hAnsi="Arial"/>
+              </w:rPr>
+              <w:t> </w:t>
+            </w:r>
+          </w:p>
+        </w:tc>
+        <w:tc>
+          <w:tcPr>
+            <w:tcW w:w="786" w:type="dxa"/>
+            <w:tcBorders>
+              <w:start w:val="double" w:sz="2" w:space="0" w:color="808080"/>
+              <w:bottom w:val="double" w:sz="2" w:space="0" w:color="808080"/>
+              <w:end w:val="double" w:sz="2" w:space="0" w:color="808080"/>
+            </w:tcBorders>
+            <w:vAlign w:val="center"/>
+          </w:tcPr>
+          <w:p>
+            <w:pPr>
+              <w:pStyle w:val="TableContents"/>
+              <w:widowControl/>
+              <w:spacing w:before="0" w:after="283"/>
+              <w:ind w:hanging="0" w:start="0" w:end="0"/>
+              <w:rPr>
+                <w:rFonts w:ascii="Arial" w:hAnsi="Arial"/>
+              </w:rPr>
+            </w:pPr>
+            <w:r>
+              <w:rPr>
+                <w:rFonts w:ascii="Arial" w:hAnsi="Arial"/>
+                <w:lang w:val="en-US"/>
+              </w:rPr>
+              <w:t>/26</w:t>
             </w:r>
             <w:r>
               <w:rPr>
@@ -2295,7 +2650,7 @@
                 <w:rFonts w:ascii="Arial" w:hAnsi="Arial"/>
                 <w:lang w:val="en-US"/>
               </w:rPr>
-              <w:t>255.255.255.128</w:t>
+              <w:t>255.255.255.192</w:t>
             </w:r>
             <w:r>
               <w:rPr>
@@ -2330,7 +2685,7 @@
                 <w:rFonts w:ascii="Arial" w:hAnsi="Arial"/>
                 <w:lang w:val="en-US"/>
               </w:rPr>
-              <w:t>69.44.8.1-69.44.8.126</w:t>
+              <w:t>69.44.8.129-69.44.8.190</w:t>
             </w:r>
             <w:r>
               <w:rPr>
@@ -2365,7 +2720,7 @@
                 <w:rFonts w:ascii="Arial" w:hAnsi="Arial"/>
                 <w:lang w:val="en-US"/>
               </w:rPr>
-              <w:t>69.44.8.127</w:t>
+              <w:t>69.44.8.191</w:t>
             </w:r>
             <w:r>
               <w:rPr>
@@ -2380,7 +2735,7 @@
         <w:trPr/>
         <w:tc>
           <w:tcPr>
-            <w:tcW w:w="1565" w:type="dxa"/>
+            <w:tcW w:w="1564" w:type="dxa"/>
             <w:tcBorders>
               <w:start w:val="double" w:sz="2" w:space="0" w:color="808080"/>
               <w:bottom w:val="double" w:sz="2" w:space="0" w:color="808080"/>
@@ -2404,7 +2759,7 @@
                 <w:rFonts w:ascii="Arial" w:hAnsi="Arial"/>
                 <w:lang w:val="en-US"/>
               </w:rPr>
-              <w:t>ASN Lan</w:t>
+              <w:t>Shared Backbone</w:t>
             </w:r>
             <w:r>
               <w:rPr>
@@ -2439,7 +2794,7 @@
                 <w:rFonts w:ascii="Arial" w:hAnsi="Arial"/>
                 <w:lang w:val="en-US"/>
               </w:rPr>
-              <w:t>45</w:t>
+              <w:t>3</w:t>
             </w:r>
             <w:r>
               <w:rPr>
@@ -2474,42 +2829,42 @@
                 <w:rFonts w:ascii="Arial" w:hAnsi="Arial"/>
                 <w:lang w:val="en-US"/>
               </w:rPr>
-              <w:t>69.44.8.128</w:t>
-            </w:r>
-            <w:r>
-              <w:rPr>
-                <w:rFonts w:ascii="Arial" w:hAnsi="Arial"/>
-              </w:rPr>
-              <w:t> </w:t>
-            </w:r>
-          </w:p>
-        </w:tc>
-        <w:tc>
-          <w:tcPr>
-            <w:tcW w:w="785" w:type="dxa"/>
-            <w:tcBorders>
-              <w:start w:val="double" w:sz="2" w:space="0" w:color="808080"/>
-              <w:bottom w:val="double" w:sz="2" w:space="0" w:color="808080"/>
-              <w:end w:val="double" w:sz="2" w:space="0" w:color="808080"/>
-            </w:tcBorders>
-            <w:vAlign w:val="center"/>
-          </w:tcPr>
-          <w:p>
-            <w:pPr>
-              <w:pStyle w:val="TableContents"/>
-              <w:widowControl/>
-              <w:spacing w:before="0" w:after="283"/>
-              <w:ind w:hanging="0" w:start="0" w:end="0"/>
-              <w:rPr>
-                <w:rFonts w:ascii="Arial" w:hAnsi="Arial"/>
-              </w:rPr>
-            </w:pPr>
-            <w:r>
-              <w:rPr>
-                <w:rFonts w:ascii="Arial" w:hAnsi="Arial"/>
-                <w:lang w:val="en-US"/>
-              </w:rPr>
-              <w:t>/26</w:t>
+              <w:t>69.44.8.192</w:t>
+            </w:r>
+            <w:r>
+              <w:rPr>
+                <w:rFonts w:ascii="Arial" w:hAnsi="Arial"/>
+              </w:rPr>
+              <w:t> </w:t>
+            </w:r>
+          </w:p>
+        </w:tc>
+        <w:tc>
+          <w:tcPr>
+            <w:tcW w:w="786" w:type="dxa"/>
+            <w:tcBorders>
+              <w:start w:val="double" w:sz="2" w:space="0" w:color="808080"/>
+              <w:bottom w:val="double" w:sz="2" w:space="0" w:color="808080"/>
+              <w:end w:val="double" w:sz="2" w:space="0" w:color="808080"/>
+            </w:tcBorders>
+            <w:vAlign w:val="center"/>
+          </w:tcPr>
+          <w:p>
+            <w:pPr>
+              <w:pStyle w:val="TableContents"/>
+              <w:widowControl/>
+              <w:spacing w:before="0" w:after="283"/>
+              <w:ind w:hanging="0" w:start="0" w:end="0"/>
+              <w:rPr>
+                <w:rFonts w:ascii="Arial" w:hAnsi="Arial"/>
+              </w:rPr>
+            </w:pPr>
+            <w:r>
+              <w:rPr>
+                <w:rFonts w:ascii="Arial" w:hAnsi="Arial"/>
+                <w:lang w:val="en-US"/>
+              </w:rPr>
+              <w:t>/29</w:t>
             </w:r>
             <w:r>
               <w:rPr>
@@ -2544,7 +2899,7 @@
                 <w:rFonts w:ascii="Arial" w:hAnsi="Arial"/>
                 <w:lang w:val="en-US"/>
               </w:rPr>
-              <w:t>255.255.255.192</w:t>
+              <w:t>255.255.255.248</w:t>
             </w:r>
             <w:r>
               <w:rPr>
@@ -2579,7 +2934,7 @@
                 <w:rFonts w:ascii="Arial" w:hAnsi="Arial"/>
                 <w:lang w:val="en-US"/>
               </w:rPr>
-              <w:t>69.44.8.129-69.44.8.190</w:t>
+              <w:t>69.44.8.193-69.44.8.198</w:t>
             </w:r>
             <w:r>
               <w:rPr>
@@ -2614,7 +2969,7 @@
                 <w:rFonts w:ascii="Arial" w:hAnsi="Arial"/>
                 <w:lang w:val="en-US"/>
               </w:rPr>
-              <w:t>69.44.8.191</w:t>
+              <w:t>69.44.8.199</w:t>
             </w:r>
             <w:r>
               <w:rPr>
@@ -2629,7 +2984,7 @@
         <w:trPr/>
         <w:tc>
           <w:tcPr>
-            <w:tcW w:w="1565" w:type="dxa"/>
+            <w:tcW w:w="1564" w:type="dxa"/>
             <w:tcBorders>
               <w:start w:val="double" w:sz="2" w:space="0" w:color="808080"/>
               <w:bottom w:val="double" w:sz="2" w:space="0" w:color="808080"/>
@@ -2653,7 +3008,7 @@
                 <w:rFonts w:ascii="Arial" w:hAnsi="Arial"/>
                 <w:lang w:val="en-US"/>
               </w:rPr>
-              <w:t>Shared Backbone</w:t>
+              <w:t>SCL-RMU</w:t>
             </w:r>
             <w:r>
               <w:rPr>
@@ -2688,7 +3043,7 @@
                 <w:rFonts w:ascii="Arial" w:hAnsi="Arial"/>
                 <w:lang w:val="en-US"/>
               </w:rPr>
-              <w:t>3</w:t>
+              <w:t>2</w:t>
             </w:r>
             <w:r>
               <w:rPr>
@@ -2723,42 +3078,42 @@
                 <w:rFonts w:ascii="Arial" w:hAnsi="Arial"/>
                 <w:lang w:val="en-US"/>
               </w:rPr>
-              <w:t>69.44.8.192</w:t>
-            </w:r>
-            <w:r>
-              <w:rPr>
-                <w:rFonts w:ascii="Arial" w:hAnsi="Arial"/>
-              </w:rPr>
-              <w:t> </w:t>
-            </w:r>
-          </w:p>
-        </w:tc>
-        <w:tc>
-          <w:tcPr>
-            <w:tcW w:w="785" w:type="dxa"/>
-            <w:tcBorders>
-              <w:start w:val="double" w:sz="2" w:space="0" w:color="808080"/>
-              <w:bottom w:val="double" w:sz="2" w:space="0" w:color="808080"/>
-              <w:end w:val="double" w:sz="2" w:space="0" w:color="808080"/>
-            </w:tcBorders>
-            <w:vAlign w:val="center"/>
-          </w:tcPr>
-          <w:p>
-            <w:pPr>
-              <w:pStyle w:val="TableContents"/>
-              <w:widowControl/>
-              <w:spacing w:before="0" w:after="283"/>
-              <w:ind w:hanging="0" w:start="0" w:end="0"/>
-              <w:rPr>
-                <w:rFonts w:ascii="Arial" w:hAnsi="Arial"/>
-              </w:rPr>
-            </w:pPr>
-            <w:r>
-              <w:rPr>
-                <w:rFonts w:ascii="Arial" w:hAnsi="Arial"/>
-                <w:lang w:val="en-US"/>
-              </w:rPr>
-              <w:t>/29</w:t>
+              <w:t>69.44.8.200</w:t>
+            </w:r>
+            <w:r>
+              <w:rPr>
+                <w:rFonts w:ascii="Arial" w:hAnsi="Arial"/>
+              </w:rPr>
+              <w:t> </w:t>
+            </w:r>
+          </w:p>
+        </w:tc>
+        <w:tc>
+          <w:tcPr>
+            <w:tcW w:w="786" w:type="dxa"/>
+            <w:tcBorders>
+              <w:start w:val="double" w:sz="2" w:space="0" w:color="808080"/>
+              <w:bottom w:val="double" w:sz="2" w:space="0" w:color="808080"/>
+              <w:end w:val="double" w:sz="2" w:space="0" w:color="808080"/>
+            </w:tcBorders>
+            <w:vAlign w:val="center"/>
+          </w:tcPr>
+          <w:p>
+            <w:pPr>
+              <w:pStyle w:val="TableContents"/>
+              <w:widowControl/>
+              <w:spacing w:before="0" w:after="283"/>
+              <w:ind w:hanging="0" w:start="0" w:end="0"/>
+              <w:rPr>
+                <w:rFonts w:ascii="Arial" w:hAnsi="Arial"/>
+              </w:rPr>
+            </w:pPr>
+            <w:r>
+              <w:rPr>
+                <w:rFonts w:ascii="Arial" w:hAnsi="Arial"/>
+                <w:lang w:val="en-US"/>
+              </w:rPr>
+              <w:t>/30</w:t>
             </w:r>
             <w:r>
               <w:rPr>
@@ -2793,7 +3148,7 @@
                 <w:rFonts w:ascii="Arial" w:hAnsi="Arial"/>
                 <w:lang w:val="en-US"/>
               </w:rPr>
-              <w:t>255.255.255.248</w:t>
+              <w:t>255.255.255.252</w:t>
             </w:r>
             <w:r>
               <w:rPr>
@@ -2828,7 +3183,7 @@
                 <w:rFonts w:ascii="Arial" w:hAnsi="Arial"/>
                 <w:lang w:val="en-US"/>
               </w:rPr>
-              <w:t>69.44.8.193-69.44.8.198</w:t>
+              <w:t>69.44.8.201-69.44.8.202</w:t>
             </w:r>
             <w:r>
               <w:rPr>
@@ -2863,7 +3218,7 @@
                 <w:rFonts w:ascii="Arial" w:hAnsi="Arial"/>
                 <w:lang w:val="en-US"/>
               </w:rPr>
-              <w:t>69.44.8.199</w:t>
+              <w:t>69.44.8.203</w:t>
             </w:r>
             <w:r>
               <w:rPr>
@@ -2878,7 +3233,7 @@
         <w:trPr/>
         <w:tc>
           <w:tcPr>
-            <w:tcW w:w="1565" w:type="dxa"/>
+            <w:tcW w:w="1564" w:type="dxa"/>
             <w:tcBorders>
               <w:start w:val="double" w:sz="2" w:space="0" w:color="808080"/>
               <w:bottom w:val="double" w:sz="2" w:space="0" w:color="808080"/>
@@ -2902,7 +3257,7 @@
                 <w:rFonts w:ascii="Arial" w:hAnsi="Arial"/>
                 <w:lang w:val="en-US"/>
               </w:rPr>
-              <w:t>SCL-RMU</w:t>
+              <w:t>SCL-DGB</w:t>
             </w:r>
             <w:r>
               <w:rPr>
@@ -2972,19 +3327,19 @@
                 <w:rFonts w:ascii="Arial" w:hAnsi="Arial"/>
                 <w:lang w:val="en-US"/>
               </w:rPr>
-              <w:t>69.44.8.200</w:t>
-            </w:r>
-            <w:r>
-              <w:rPr>
-                <w:rFonts w:ascii="Arial" w:hAnsi="Arial"/>
-              </w:rPr>
-              <w:t> </w:t>
-            </w:r>
-          </w:p>
-        </w:tc>
-        <w:tc>
-          <w:tcPr>
-            <w:tcW w:w="785" w:type="dxa"/>
+              <w:t>69.44.8.204</w:t>
+            </w:r>
+            <w:r>
+              <w:rPr>
+                <w:rFonts w:ascii="Arial" w:hAnsi="Arial"/>
+              </w:rPr>
+              <w:t> </w:t>
+            </w:r>
+          </w:p>
+        </w:tc>
+        <w:tc>
+          <w:tcPr>
+            <w:tcW w:w="786" w:type="dxa"/>
             <w:tcBorders>
               <w:start w:val="double" w:sz="2" w:space="0" w:color="808080"/>
               <w:bottom w:val="double" w:sz="2" w:space="0" w:color="808080"/>
@@ -3077,7 +3432,7 @@
                 <w:rFonts w:ascii="Arial" w:hAnsi="Arial"/>
                 <w:lang w:val="en-US"/>
               </w:rPr>
-              <w:t>69.44.8.201-69.44.8.202</w:t>
+              <w:t>69.44.8.205-69.44.8.206</w:t>
             </w:r>
             <w:r>
               <w:rPr>
@@ -3112,7 +3467,7 @@
                 <w:rFonts w:ascii="Arial" w:hAnsi="Arial"/>
                 <w:lang w:val="en-US"/>
               </w:rPr>
-              <w:t>69.44.8.203</w:t>
+              <w:t>69.44.8.207</w:t>
             </w:r>
             <w:r>
               <w:rPr>
@@ -3127,7 +3482,7 @@
         <w:trPr/>
         <w:tc>
           <w:tcPr>
-            <w:tcW w:w="1565" w:type="dxa"/>
+            <w:tcW w:w="1564" w:type="dxa"/>
             <w:tcBorders>
               <w:start w:val="double" w:sz="2" w:space="0" w:color="808080"/>
               <w:bottom w:val="double" w:sz="2" w:space="0" w:color="808080"/>
@@ -3151,7 +3506,7 @@
                 <w:rFonts w:ascii="Arial" w:hAnsi="Arial"/>
                 <w:lang w:val="en-US"/>
               </w:rPr>
-              <w:t>SCL-DGB</w:t>
+              <w:t>SCL-GVU</w:t>
             </w:r>
             <w:r>
               <w:rPr>
@@ -3221,19 +3576,19 @@
                 <w:rFonts w:ascii="Arial" w:hAnsi="Arial"/>
                 <w:lang w:val="en-US"/>
               </w:rPr>
-              <w:t>69.44.8.204</w:t>
-            </w:r>
-            <w:r>
-              <w:rPr>
-                <w:rFonts w:ascii="Arial" w:hAnsi="Arial"/>
-              </w:rPr>
-              <w:t> </w:t>
-            </w:r>
-          </w:p>
-        </w:tc>
-        <w:tc>
-          <w:tcPr>
-            <w:tcW w:w="785" w:type="dxa"/>
+              <w:t>69.44.8.208</w:t>
+            </w:r>
+            <w:r>
+              <w:rPr>
+                <w:rFonts w:ascii="Arial" w:hAnsi="Arial"/>
+              </w:rPr>
+              <w:t> </w:t>
+            </w:r>
+          </w:p>
+        </w:tc>
+        <w:tc>
+          <w:tcPr>
+            <w:tcW w:w="786" w:type="dxa"/>
             <w:tcBorders>
               <w:start w:val="double" w:sz="2" w:space="0" w:color="808080"/>
               <w:bottom w:val="double" w:sz="2" w:space="0" w:color="808080"/>
@@ -3326,7 +3681,7 @@
                 <w:rFonts w:ascii="Arial" w:hAnsi="Arial"/>
                 <w:lang w:val="en-US"/>
               </w:rPr>
-              <w:t>69.44.8.205-69.44.8.206</w:t>
+              <w:t>69.44.8.209-69.44.8.210</w:t>
             </w:r>
             <w:r>
               <w:rPr>
@@ -3361,7 +3716,7 @@
                 <w:rFonts w:ascii="Arial" w:hAnsi="Arial"/>
                 <w:lang w:val="en-US"/>
               </w:rPr>
-              <w:t>69.44.8.207</w:t>
+              <w:t>69.44.8.211</w:t>
             </w:r>
             <w:r>
               <w:rPr>
@@ -3376,7 +3731,7 @@
         <w:trPr/>
         <w:tc>
           <w:tcPr>
-            <w:tcW w:w="1565" w:type="dxa"/>
+            <w:tcW w:w="1564" w:type="dxa"/>
             <w:tcBorders>
               <w:start w:val="double" w:sz="2" w:space="0" w:color="808080"/>
               <w:bottom w:val="double" w:sz="2" w:space="0" w:color="808080"/>
@@ -3400,7 +3755,7 @@
                 <w:rFonts w:ascii="Arial" w:hAnsi="Arial"/>
                 <w:lang w:val="en-US"/>
               </w:rPr>
-              <w:t>SCL-GVU</w:t>
+              <w:t>DBG-MDU</w:t>
             </w:r>
             <w:r>
               <w:rPr>
@@ -3470,19 +3825,19 @@
                 <w:rFonts w:ascii="Arial" w:hAnsi="Arial"/>
                 <w:lang w:val="en-US"/>
               </w:rPr>
-              <w:t>69.44.8.208</w:t>
-            </w:r>
-            <w:r>
-              <w:rPr>
-                <w:rFonts w:ascii="Arial" w:hAnsi="Arial"/>
-              </w:rPr>
-              <w:t> </w:t>
-            </w:r>
-          </w:p>
-        </w:tc>
-        <w:tc>
-          <w:tcPr>
-            <w:tcW w:w="785" w:type="dxa"/>
+              <w:t>69.44.8.212</w:t>
+            </w:r>
+            <w:r>
+              <w:rPr>
+                <w:rFonts w:ascii="Arial" w:hAnsi="Arial"/>
+              </w:rPr>
+              <w:t> </w:t>
+            </w:r>
+          </w:p>
+        </w:tc>
+        <w:tc>
+          <w:tcPr>
+            <w:tcW w:w="786" w:type="dxa"/>
             <w:tcBorders>
               <w:start w:val="double" w:sz="2" w:space="0" w:color="808080"/>
               <w:bottom w:val="double" w:sz="2" w:space="0" w:color="808080"/>
@@ -3575,7 +3930,7 @@
                 <w:rFonts w:ascii="Arial" w:hAnsi="Arial"/>
                 <w:lang w:val="en-US"/>
               </w:rPr>
-              <w:t>69.44.8.209-69.44.8.210</w:t>
+              <w:t>69.44.8.213-69.44.8.214</w:t>
             </w:r>
             <w:r>
               <w:rPr>
@@ -3610,7 +3965,7 @@
                 <w:rFonts w:ascii="Arial" w:hAnsi="Arial"/>
                 <w:lang w:val="en-US"/>
               </w:rPr>
-              <w:t>69.44.8.211</w:t>
+              <w:t>69.44.8.215</w:t>
             </w:r>
             <w:r>
               <w:rPr>
@@ -3625,7 +3980,7 @@
         <w:trPr/>
         <w:tc>
           <w:tcPr>
-            <w:tcW w:w="1565" w:type="dxa"/>
+            <w:tcW w:w="1564" w:type="dxa"/>
             <w:tcBorders>
               <w:start w:val="double" w:sz="2" w:space="0" w:color="808080"/>
               <w:bottom w:val="double" w:sz="2" w:space="0" w:color="808080"/>
@@ -3649,7 +4004,7 @@
                 <w:rFonts w:ascii="Arial" w:hAnsi="Arial"/>
                 <w:lang w:val="en-US"/>
               </w:rPr>
-              <w:t>DBG-MDU</w:t>
+              <w:t>MDU-GVU</w:t>
             </w:r>
             <w:r>
               <w:rPr>
@@ -3719,19 +4074,19 @@
                 <w:rFonts w:ascii="Arial" w:hAnsi="Arial"/>
                 <w:lang w:val="en-US"/>
               </w:rPr>
-              <w:t>69.44.8.212</w:t>
-            </w:r>
-            <w:r>
-              <w:rPr>
-                <w:rFonts w:ascii="Arial" w:hAnsi="Arial"/>
-              </w:rPr>
-              <w:t> </w:t>
-            </w:r>
-          </w:p>
-        </w:tc>
-        <w:tc>
-          <w:tcPr>
-            <w:tcW w:w="785" w:type="dxa"/>
+              <w:t>69.44.8.216</w:t>
+            </w:r>
+            <w:r>
+              <w:rPr>
+                <w:rFonts w:ascii="Arial" w:hAnsi="Arial"/>
+              </w:rPr>
+              <w:t> </w:t>
+            </w:r>
+          </w:p>
+        </w:tc>
+        <w:tc>
+          <w:tcPr>
+            <w:tcW w:w="786" w:type="dxa"/>
             <w:tcBorders>
               <w:start w:val="double" w:sz="2" w:space="0" w:color="808080"/>
               <w:bottom w:val="double" w:sz="2" w:space="0" w:color="808080"/>
@@ -3824,7 +4179,7 @@
                 <w:rFonts w:ascii="Arial" w:hAnsi="Arial"/>
                 <w:lang w:val="en-US"/>
               </w:rPr>
-              <w:t>69.44.8.213-69.44.8.214</w:t>
+              <w:t>69.44.8.217-69.44.8.218</w:t>
             </w:r>
             <w:r>
               <w:rPr>
@@ -3859,7 +4214,7 @@
                 <w:rFonts w:ascii="Arial" w:hAnsi="Arial"/>
                 <w:lang w:val="en-US"/>
               </w:rPr>
-              <w:t>69.44.8.215</w:t>
+              <w:t>69.44.8.219</w:t>
             </w:r>
             <w:r>
               <w:rPr>
@@ -3874,7 +4229,7 @@
         <w:trPr/>
         <w:tc>
           <w:tcPr>
-            <w:tcW w:w="1565" w:type="dxa"/>
+            <w:tcW w:w="1564" w:type="dxa"/>
             <w:tcBorders>
               <w:start w:val="double" w:sz="2" w:space="0" w:color="808080"/>
               <w:bottom w:val="double" w:sz="2" w:space="0" w:color="808080"/>
@@ -3898,8 +4253,25 @@
                 <w:rFonts w:ascii="Arial" w:hAnsi="Arial"/>
                 <w:lang w:val="en-US"/>
               </w:rPr>
-              <w:t>MDU-GVU</w:t>
-            </w:r>
+              <w:t>GVU-ASN</w:t>
+            </w:r>
+            <w:r>
+              <w:rPr>
+                <w:rFonts w:ascii="Arial" w:hAnsi="Arial"/>
+              </w:rPr>
+              <w:t> </w:t>
+            </w:r>
+          </w:p>
+          <w:p>
+            <w:pPr>
+              <w:pStyle w:val="TableContents"/>
+              <w:widowControl/>
+              <w:spacing w:before="0" w:after="283"/>
+              <w:ind w:hanging="0" w:start="0" w:end="0"/>
+              <w:rPr>
+                <w:rFonts w:ascii="Arial" w:hAnsi="Arial"/>
+              </w:rPr>
+            </w:pPr>
             <w:r>
               <w:rPr>
                 <w:rFonts w:ascii="Arial" w:hAnsi="Arial"/>
@@ -3942,6 +4314,23 @@
               <w:t> </w:t>
             </w:r>
           </w:p>
+          <w:p>
+            <w:pPr>
+              <w:pStyle w:val="TableContents"/>
+              <w:widowControl/>
+              <w:spacing w:before="0" w:after="283"/>
+              <w:ind w:hanging="0" w:start="0" w:end="0"/>
+              <w:rPr>
+                <w:rFonts w:ascii="Arial" w:hAnsi="Arial"/>
+              </w:rPr>
+            </w:pPr>
+            <w:r>
+              <w:rPr>
+                <w:rFonts w:ascii="Arial" w:hAnsi="Arial"/>
+              </w:rPr>
+              <w:t> </w:t>
+            </w:r>
+          </w:p>
         </w:tc>
         <w:tc>
           <w:tcPr>
@@ -3968,19 +4357,36 @@
                 <w:rFonts w:ascii="Arial" w:hAnsi="Arial"/>
                 <w:lang w:val="en-US"/>
               </w:rPr>
-              <w:t>69.44.8.216</w:t>
-            </w:r>
-            <w:r>
-              <w:rPr>
-                <w:rFonts w:ascii="Arial" w:hAnsi="Arial"/>
-              </w:rPr>
-              <w:t> </w:t>
-            </w:r>
-          </w:p>
-        </w:tc>
-        <w:tc>
-          <w:tcPr>
-            <w:tcW w:w="785" w:type="dxa"/>
+              <w:t>69.44.8.220</w:t>
+            </w:r>
+            <w:r>
+              <w:rPr>
+                <w:rFonts w:ascii="Arial" w:hAnsi="Arial"/>
+              </w:rPr>
+              <w:t> </w:t>
+            </w:r>
+          </w:p>
+          <w:p>
+            <w:pPr>
+              <w:pStyle w:val="TableContents"/>
+              <w:widowControl/>
+              <w:spacing w:before="0" w:after="283"/>
+              <w:ind w:hanging="0" w:start="0" w:end="0"/>
+              <w:rPr>
+                <w:rFonts w:ascii="Arial" w:hAnsi="Arial"/>
+              </w:rPr>
+            </w:pPr>
+            <w:r>
+              <w:rPr>
+                <w:rFonts w:ascii="Arial" w:hAnsi="Arial"/>
+              </w:rPr>
+              <w:t> </w:t>
+            </w:r>
+          </w:p>
+        </w:tc>
+        <w:tc>
+          <w:tcPr>
+            <w:tcW w:w="786" w:type="dxa"/>
             <w:tcBorders>
               <w:start w:val="double" w:sz="2" w:space="0" w:color="808080"/>
               <w:bottom w:val="double" w:sz="2" w:space="0" w:color="808080"/>
@@ -4012,6 +4418,23 @@
               <w:t> </w:t>
             </w:r>
           </w:p>
+          <w:p>
+            <w:pPr>
+              <w:pStyle w:val="TableContents"/>
+              <w:widowControl/>
+              <w:spacing w:before="0" w:after="283"/>
+              <w:ind w:hanging="0" w:start="0" w:end="0"/>
+              <w:rPr>
+                <w:rFonts w:ascii="Arial" w:hAnsi="Arial"/>
+              </w:rPr>
+            </w:pPr>
+            <w:r>
+              <w:rPr>
+                <w:rFonts w:ascii="Arial" w:hAnsi="Arial"/>
+              </w:rPr>
+              <w:t> </w:t>
+            </w:r>
+          </w:p>
         </w:tc>
         <w:tc>
           <w:tcPr>
@@ -4047,6 +4470,23 @@
               <w:t> </w:t>
             </w:r>
           </w:p>
+          <w:p>
+            <w:pPr>
+              <w:pStyle w:val="TableContents"/>
+              <w:widowControl/>
+              <w:spacing w:before="0" w:after="283"/>
+              <w:ind w:hanging="0" w:start="0" w:end="0"/>
+              <w:rPr>
+                <w:rFonts w:ascii="Arial" w:hAnsi="Arial"/>
+              </w:rPr>
+            </w:pPr>
+            <w:r>
+              <w:rPr>
+                <w:rFonts w:ascii="Arial" w:hAnsi="Arial"/>
+              </w:rPr>
+              <w:t> </w:t>
+            </w:r>
+          </w:p>
         </w:tc>
         <w:tc>
           <w:tcPr>
@@ -4073,8 +4513,25 @@
                 <w:rFonts w:ascii="Arial" w:hAnsi="Arial"/>
                 <w:lang w:val="en-US"/>
               </w:rPr>
-              <w:t>69.44.8.217-69.44.8.218</w:t>
-            </w:r>
+              <w:t>69.44.8.221-69.44.8.222</w:t>
+            </w:r>
+            <w:r>
+              <w:rPr>
+                <w:rFonts w:ascii="Arial" w:hAnsi="Arial"/>
+              </w:rPr>
+              <w:t> </w:t>
+            </w:r>
+          </w:p>
+          <w:p>
+            <w:pPr>
+              <w:pStyle w:val="TableContents"/>
+              <w:widowControl/>
+              <w:spacing w:before="0" w:after="283"/>
+              <w:ind w:hanging="0" w:start="0" w:end="0"/>
+              <w:rPr>
+                <w:rFonts w:ascii="Arial" w:hAnsi="Arial"/>
+              </w:rPr>
+            </w:pPr>
             <w:r>
               <w:rPr>
                 <w:rFonts w:ascii="Arial" w:hAnsi="Arial"/>
@@ -4108,255 +4565,6 @@
                 <w:rFonts w:ascii="Arial" w:hAnsi="Arial"/>
                 <w:lang w:val="en-US"/>
               </w:rPr>
-              <w:t>69.44.8.219</w:t>
-            </w:r>
-            <w:r>
-              <w:rPr>
-                <w:rFonts w:ascii="Arial" w:hAnsi="Arial"/>
-              </w:rPr>
-              <w:t> </w:t>
-            </w:r>
-          </w:p>
-        </w:tc>
-      </w:tr>
-      <w:tr>
-        <w:trPr/>
-        <w:tc>
-          <w:tcPr>
-            <w:tcW w:w="1565" w:type="dxa"/>
-            <w:tcBorders>
-              <w:start w:val="double" w:sz="2" w:space="0" w:color="808080"/>
-              <w:bottom w:val="double" w:sz="2" w:space="0" w:color="808080"/>
-              <w:end w:val="double" w:sz="2" w:space="0" w:color="808080"/>
-            </w:tcBorders>
-            <w:vAlign w:val="center"/>
-          </w:tcPr>
-          <w:p>
-            <w:pPr>
-              <w:pStyle w:val="TableContents"/>
-              <w:widowControl/>
-              <w:spacing w:before="0" w:after="283"/>
-              <w:ind w:hanging="0" w:start="0" w:end="0"/>
-              <w:jc w:val="center"/>
-              <w:rPr>
-                <w:rFonts w:ascii="Arial" w:hAnsi="Arial"/>
-              </w:rPr>
-            </w:pPr>
-            <w:r>
-              <w:rPr>
-                <w:rFonts w:ascii="Arial" w:hAnsi="Arial"/>
-                <w:lang w:val="en-US"/>
-              </w:rPr>
-              <w:t>GVU-ASN</w:t>
-            </w:r>
-            <w:r>
-              <w:rPr>
-                <w:rFonts w:ascii="Arial" w:hAnsi="Arial"/>
-              </w:rPr>
-              <w:t> </w:t>
-            </w:r>
-          </w:p>
-        </w:tc>
-        <w:tc>
-          <w:tcPr>
-            <w:tcW w:w="865" w:type="dxa"/>
-            <w:tcBorders>
-              <w:start w:val="double" w:sz="2" w:space="0" w:color="808080"/>
-              <w:bottom w:val="double" w:sz="2" w:space="0" w:color="808080"/>
-              <w:end w:val="double" w:sz="2" w:space="0" w:color="808080"/>
-            </w:tcBorders>
-            <w:vAlign w:val="center"/>
-          </w:tcPr>
-          <w:p>
-            <w:pPr>
-              <w:pStyle w:val="TableContents"/>
-              <w:widowControl/>
-              <w:spacing w:before="0" w:after="283"/>
-              <w:ind w:hanging="0" w:start="0" w:end="0"/>
-              <w:rPr>
-                <w:rFonts w:ascii="Arial" w:hAnsi="Arial"/>
-              </w:rPr>
-            </w:pPr>
-            <w:r>
-              <w:rPr>
-                <w:rFonts w:ascii="Arial" w:hAnsi="Arial"/>
-                <w:lang w:val="en-US"/>
-              </w:rPr>
-              <w:t>2</w:t>
-            </w:r>
-            <w:r>
-              <w:rPr>
-                <w:rFonts w:ascii="Arial" w:hAnsi="Arial"/>
-              </w:rPr>
-              <w:t> </w:t>
-            </w:r>
-          </w:p>
-        </w:tc>
-        <w:tc>
-          <w:tcPr>
-            <w:tcW w:w="1439" w:type="dxa"/>
-            <w:tcBorders>
-              <w:start w:val="double" w:sz="2" w:space="0" w:color="808080"/>
-              <w:bottom w:val="double" w:sz="2" w:space="0" w:color="808080"/>
-              <w:end w:val="double" w:sz="2" w:space="0" w:color="808080"/>
-            </w:tcBorders>
-            <w:vAlign w:val="center"/>
-          </w:tcPr>
-          <w:p>
-            <w:pPr>
-              <w:pStyle w:val="TableContents"/>
-              <w:widowControl/>
-              <w:spacing w:before="0" w:after="283"/>
-              <w:ind w:hanging="0" w:start="0" w:end="0"/>
-              <w:rPr>
-                <w:rFonts w:ascii="Arial" w:hAnsi="Arial"/>
-              </w:rPr>
-            </w:pPr>
-            <w:r>
-              <w:rPr>
-                <w:rFonts w:ascii="Arial" w:hAnsi="Arial"/>
-                <w:lang w:val="en-US"/>
-              </w:rPr>
-              <w:t>69.44.8.220</w:t>
-            </w:r>
-            <w:r>
-              <w:rPr>
-                <w:rFonts w:ascii="Arial" w:hAnsi="Arial"/>
-              </w:rPr>
-              <w:t> </w:t>
-            </w:r>
-          </w:p>
-        </w:tc>
-        <w:tc>
-          <w:tcPr>
-            <w:tcW w:w="785" w:type="dxa"/>
-            <w:tcBorders>
-              <w:start w:val="double" w:sz="2" w:space="0" w:color="808080"/>
-              <w:bottom w:val="double" w:sz="2" w:space="0" w:color="808080"/>
-              <w:end w:val="double" w:sz="2" w:space="0" w:color="808080"/>
-            </w:tcBorders>
-            <w:vAlign w:val="center"/>
-          </w:tcPr>
-          <w:p>
-            <w:pPr>
-              <w:pStyle w:val="TableContents"/>
-              <w:widowControl/>
-              <w:spacing w:before="0" w:after="283"/>
-              <w:ind w:hanging="0" w:start="0" w:end="0"/>
-              <w:rPr>
-                <w:rFonts w:ascii="Arial" w:hAnsi="Arial"/>
-              </w:rPr>
-            </w:pPr>
-            <w:r>
-              <w:rPr>
-                <w:rFonts w:ascii="Arial" w:hAnsi="Arial"/>
-                <w:lang w:val="en-US"/>
-              </w:rPr>
-              <w:t>/30</w:t>
-            </w:r>
-            <w:r>
-              <w:rPr>
-                <w:rFonts w:ascii="Arial" w:hAnsi="Arial"/>
-              </w:rPr>
-              <w:t> </w:t>
-            </w:r>
-          </w:p>
-        </w:tc>
-        <w:tc>
-          <w:tcPr>
-            <w:tcW w:w="1973" w:type="dxa"/>
-            <w:tcBorders>
-              <w:start w:val="double" w:sz="2" w:space="0" w:color="808080"/>
-              <w:bottom w:val="double" w:sz="2" w:space="0" w:color="808080"/>
-              <w:end w:val="double" w:sz="2" w:space="0" w:color="808080"/>
-            </w:tcBorders>
-            <w:vAlign w:val="center"/>
-          </w:tcPr>
-          <w:p>
-            <w:pPr>
-              <w:pStyle w:val="TableContents"/>
-              <w:widowControl/>
-              <w:spacing w:before="0" w:after="283"/>
-              <w:ind w:hanging="0" w:start="0" w:end="0"/>
-              <w:rPr>
-                <w:rFonts w:ascii="Arial" w:hAnsi="Arial"/>
-              </w:rPr>
-            </w:pPr>
-            <w:r>
-              <w:rPr>
-                <w:rFonts w:ascii="Arial" w:hAnsi="Arial"/>
-                <w:lang w:val="en-US"/>
-              </w:rPr>
-              <w:t>255.255.255.252</w:t>
-            </w:r>
-            <w:r>
-              <w:rPr>
-                <w:rFonts w:ascii="Arial" w:hAnsi="Arial"/>
-              </w:rPr>
-              <w:t> </w:t>
-            </w:r>
-          </w:p>
-        </w:tc>
-        <w:tc>
-          <w:tcPr>
-            <w:tcW w:w="1859" w:type="dxa"/>
-            <w:tcBorders>
-              <w:start w:val="double" w:sz="2" w:space="0" w:color="808080"/>
-              <w:bottom w:val="double" w:sz="2" w:space="0" w:color="808080"/>
-              <w:end w:val="double" w:sz="2" w:space="0" w:color="808080"/>
-            </w:tcBorders>
-            <w:vAlign w:val="center"/>
-          </w:tcPr>
-          <w:p>
-            <w:pPr>
-              <w:pStyle w:val="TableContents"/>
-              <w:widowControl/>
-              <w:spacing w:before="0" w:after="283"/>
-              <w:ind w:hanging="0" w:start="0" w:end="0"/>
-              <w:rPr>
-                <w:rFonts w:ascii="Arial" w:hAnsi="Arial"/>
-              </w:rPr>
-            </w:pPr>
-            <w:r>
-              <w:rPr>
-                <w:rFonts w:ascii="Arial" w:hAnsi="Arial"/>
-                <w:lang w:val="en-US"/>
-              </w:rPr>
-              <w:t>69.44.8.221-69.44.8.222</w:t>
-            </w:r>
-            <w:r>
-              <w:rPr>
-                <w:rFonts w:ascii="Arial" w:hAnsi="Arial"/>
-              </w:rPr>
-              <w:t> </w:t>
-            </w:r>
-          </w:p>
-        </w:tc>
-        <w:tc>
-          <w:tcPr>
-            <w:tcW w:w="1444" w:type="dxa"/>
-            <w:tcBorders>
-              <w:start w:val="double" w:sz="2" w:space="0" w:color="808080"/>
-              <w:bottom w:val="double" w:sz="2" w:space="0" w:color="808080"/>
-              <w:end w:val="double" w:sz="2" w:space="0" w:color="808080"/>
-            </w:tcBorders>
-            <w:vAlign w:val="center"/>
-          </w:tcPr>
-          <w:p>
-            <w:pPr>
-              <w:pStyle w:val="TableContents"/>
-              <w:widowControl/>
-              <w:spacing w:before="0" w:after="283"/>
-              <w:ind w:hanging="0" w:start="0" w:end="0"/>
-              <w:rPr>
-                <w:rFonts w:ascii="Arial" w:hAnsi="Arial"/>
-              </w:rPr>
-            </w:pPr>
-            <w:r>
-              <w:rPr>
-                <w:rFonts w:ascii="Arial" w:hAnsi="Arial"/>
-                <w:lang w:val="en-US"/>
-              </w:rPr>
               <w:t>69.44.8.223</w:t>
             </w:r>
             <w:r>
@@ -4383,188 +4591,6 @@
               <w:t> </w:t>
             </w:r>
           </w:p>
-        </w:tc>
-      </w:tr>
-      <w:tr>
-        <w:trPr/>
-        <w:tc>
-          <w:tcPr>
-            <w:tcW w:w="1565" w:type="dxa"/>
-            <w:tcBorders>
-              <w:start w:val="double" w:sz="2" w:space="0" w:color="808080"/>
-              <w:bottom w:val="double" w:sz="2" w:space="0" w:color="808080"/>
-              <w:end w:val="double" w:sz="2" w:space="0" w:color="808080"/>
-            </w:tcBorders>
-            <w:vAlign w:val="center"/>
-          </w:tcPr>
-          <w:p>
-            <w:pPr>
-              <w:pStyle w:val="TableContents"/>
-              <w:widowControl/>
-              <w:spacing w:before="0" w:after="283"/>
-              <w:ind w:hanging="0" w:start="0" w:end="0"/>
-              <w:rPr>
-                <w:rFonts w:ascii="Arial" w:hAnsi="Arial"/>
-              </w:rPr>
-            </w:pPr>
-            <w:r>
-              <w:rPr>
-                <w:rFonts w:ascii="Arial" w:hAnsi="Arial"/>
-              </w:rPr>
-              <w:t> </w:t>
-            </w:r>
-          </w:p>
-        </w:tc>
-        <w:tc>
-          <w:tcPr>
-            <w:tcW w:w="865" w:type="dxa"/>
-            <w:tcBorders>
-              <w:start w:val="double" w:sz="2" w:space="0" w:color="808080"/>
-              <w:bottom w:val="double" w:sz="2" w:space="0" w:color="808080"/>
-              <w:end w:val="double" w:sz="2" w:space="0" w:color="808080"/>
-            </w:tcBorders>
-            <w:vAlign w:val="center"/>
-          </w:tcPr>
-          <w:p>
-            <w:pPr>
-              <w:pStyle w:val="TableContents"/>
-              <w:widowControl/>
-              <w:spacing w:before="0" w:after="283"/>
-              <w:ind w:hanging="0" w:start="0" w:end="0"/>
-              <w:rPr>
-                <w:rFonts w:ascii="Arial" w:hAnsi="Arial"/>
-              </w:rPr>
-            </w:pPr>
-            <w:r>
-              <w:rPr>
-                <w:rFonts w:ascii="Arial" w:hAnsi="Arial"/>
-              </w:rPr>
-              <w:t> </w:t>
-            </w:r>
-          </w:p>
-        </w:tc>
-        <w:tc>
-          <w:tcPr>
-            <w:tcW w:w="1439" w:type="dxa"/>
-            <w:tcBorders>
-              <w:start w:val="double" w:sz="2" w:space="0" w:color="808080"/>
-              <w:bottom w:val="double" w:sz="2" w:space="0" w:color="808080"/>
-              <w:end w:val="double" w:sz="2" w:space="0" w:color="808080"/>
-            </w:tcBorders>
-            <w:vAlign w:val="center"/>
-          </w:tcPr>
-          <w:p>
-            <w:pPr>
-              <w:pStyle w:val="TableContents"/>
-              <w:widowControl/>
-              <w:spacing w:before="0" w:after="283"/>
-              <w:ind w:hanging="0" w:start="0" w:end="0"/>
-              <w:rPr>
-                <w:rFonts w:ascii="Arial" w:hAnsi="Arial"/>
-              </w:rPr>
-            </w:pPr>
-            <w:r>
-              <w:rPr>
-                <w:rFonts w:ascii="Arial" w:hAnsi="Arial"/>
-              </w:rPr>
-              <w:t> </w:t>
-            </w:r>
-          </w:p>
-        </w:tc>
-        <w:tc>
-          <w:tcPr>
-            <w:tcW w:w="785" w:type="dxa"/>
-            <w:tcBorders>
-              <w:start w:val="double" w:sz="2" w:space="0" w:color="808080"/>
-              <w:bottom w:val="double" w:sz="2" w:space="0" w:color="808080"/>
-              <w:end w:val="double" w:sz="2" w:space="0" w:color="808080"/>
-            </w:tcBorders>
-            <w:vAlign w:val="center"/>
-          </w:tcPr>
-          <w:p>
-            <w:pPr>
-              <w:pStyle w:val="TableContents"/>
-              <w:widowControl/>
-              <w:spacing w:before="0" w:after="283"/>
-              <w:ind w:hanging="0" w:start="0" w:end="0"/>
-              <w:rPr>
-                <w:rFonts w:ascii="Arial" w:hAnsi="Arial"/>
-              </w:rPr>
-            </w:pPr>
-            <w:r>
-              <w:rPr>
-                <w:rFonts w:ascii="Arial" w:hAnsi="Arial"/>
-              </w:rPr>
-              <w:t> </w:t>
-            </w:r>
-          </w:p>
-        </w:tc>
-        <w:tc>
-          <w:tcPr>
-            <w:tcW w:w="1973" w:type="dxa"/>
-            <w:tcBorders>
-              <w:start w:val="double" w:sz="2" w:space="0" w:color="808080"/>
-              <w:bottom w:val="double" w:sz="2" w:space="0" w:color="808080"/>
-              <w:end w:val="double" w:sz="2" w:space="0" w:color="808080"/>
-            </w:tcBorders>
-            <w:vAlign w:val="center"/>
-          </w:tcPr>
-          <w:p>
-            <w:pPr>
-              <w:pStyle w:val="TableContents"/>
-              <w:widowControl/>
-              <w:spacing w:before="0" w:after="283"/>
-              <w:ind w:hanging="0" w:start="0" w:end="0"/>
-              <w:rPr>
-                <w:rFonts w:ascii="Arial" w:hAnsi="Arial"/>
-              </w:rPr>
-            </w:pPr>
-            <w:r>
-              <w:rPr>
-                <w:rFonts w:ascii="Arial" w:hAnsi="Arial"/>
-              </w:rPr>
-              <w:t> </w:t>
-            </w:r>
-          </w:p>
-        </w:tc>
-        <w:tc>
-          <w:tcPr>
-            <w:tcW w:w="1859" w:type="dxa"/>
-            <w:tcBorders>
-              <w:start w:val="double" w:sz="2" w:space="0" w:color="808080"/>
-              <w:bottom w:val="double" w:sz="2" w:space="0" w:color="808080"/>
-              <w:end w:val="double" w:sz="2" w:space="0" w:color="808080"/>
-            </w:tcBorders>
-            <w:vAlign w:val="center"/>
-          </w:tcPr>
-          <w:p>
-            <w:pPr>
-              <w:pStyle w:val="TableContents"/>
-              <w:widowControl/>
-              <w:spacing w:before="0" w:after="283"/>
-              <w:ind w:hanging="0" w:start="0" w:end="0"/>
-              <w:rPr>
-                <w:rFonts w:ascii="Arial" w:hAnsi="Arial"/>
-              </w:rPr>
-            </w:pPr>
-            <w:r>
-              <w:rPr>
-                <w:rFonts w:ascii="Arial" w:hAnsi="Arial"/>
-              </w:rPr>
-              <w:t> </w:t>
-            </w:r>
-          </w:p>
-        </w:tc>
-        <w:tc>
-          <w:tcPr>
-            <w:tcW w:w="1444" w:type="dxa"/>
-            <w:tcBorders>
-              <w:start w:val="double" w:sz="2" w:space="0" w:color="808080"/>
-              <w:bottom w:val="double" w:sz="2" w:space="0" w:color="808080"/>
-              <w:end w:val="double" w:sz="2" w:space="0" w:color="808080"/>
-            </w:tcBorders>
-            <w:vAlign w:val="center"/>
-          </w:tcPr>
           <w:p>
             <w:pPr>
               <w:pStyle w:val="TableContents"/>
@@ -4648,7 +4674,6 @@
           <w:type w:val="continuous"/>
           <w:pgSz w:w="12240" w:h="15840"/>
           <w:pgMar w:left="1134" w:right="1134" w:gutter="0" w:header="0" w:top="1134" w:footer="0" w:bottom="1134"/>
-          <w:pgNumType w:fmt="decimal"/>
           <w:formProt w:val="false"/>
           <w:textDirection w:val="lrTb"/>
           <w:docGrid w:type="default" w:linePitch="100" w:charSpace="0"/>
@@ -4697,8 +4722,8 @@
       </w:tblPr>
       <w:tblGrid>
         <w:gridCol w:w="2250"/>
-        <w:gridCol w:w="1710"/>
-        <w:gridCol w:w="885"/>
+        <w:gridCol w:w="1709"/>
+        <w:gridCol w:w="886"/>
         <w:gridCol w:w="1440"/>
         <w:gridCol w:w="1980"/>
         <w:gridCol w:w="1605"/>
@@ -4736,48 +4761,39 @@
                 <w:szCs w:val="20"/>
                 <w:lang w:val="en-US"/>
               </w:rPr>
-              <w:t>N</w:t>
-            </w:r>
-            <w:r>
+              <w:t>Network</w:t>
+            </w:r>
+          </w:p>
+        </w:tc>
+        <w:tc>
+          <w:tcPr>
+            <w:tcW w:w="1709" w:type="dxa"/>
+            <w:tcBorders>
+              <w:top w:val="double" w:sz="2" w:space="0" w:color="808080"/>
+              <w:start w:val="double" w:sz="2" w:space="0" w:color="808080"/>
+              <w:bottom w:val="double" w:sz="2" w:space="0" w:color="808080"/>
+              <w:end w:val="double" w:sz="2" w:space="0" w:color="808080"/>
+            </w:tcBorders>
+            <w:vAlign w:val="center"/>
+          </w:tcPr>
+          <w:p>
+            <w:pPr>
+              <w:pStyle w:val="TableContents"/>
+              <w:widowControl/>
+              <w:spacing w:before="0" w:after="283"/>
+              <w:ind w:hanging="0" w:start="0" w:end="0"/>
+              <w:jc w:val="center"/>
               <w:rPr>
                 <w:rFonts w:ascii="Arial" w:hAnsi="Arial"/>
                 <w:sz w:val="20"/>
                 <w:szCs w:val="20"/>
-                <w:lang w:val="en-US"/>
-              </w:rPr>
-              <w:t>etwork</w:t>
-            </w:r>
-          </w:p>
-        </w:tc>
-        <w:tc>
-          <w:tcPr>
-            <w:tcW w:w="1710" w:type="dxa"/>
-            <w:tcBorders>
-              <w:top w:val="double" w:sz="2" w:space="0" w:color="808080"/>
-              <w:start w:val="double" w:sz="2" w:space="0" w:color="808080"/>
-              <w:bottom w:val="double" w:sz="2" w:space="0" w:color="808080"/>
-              <w:end w:val="double" w:sz="2" w:space="0" w:color="808080"/>
-            </w:tcBorders>
-            <w:vAlign w:val="center"/>
-          </w:tcPr>
-          <w:p>
-            <w:pPr>
-              <w:pStyle w:val="TableContents"/>
-              <w:widowControl/>
-              <w:spacing w:before="0" w:after="283"/>
-              <w:ind w:hanging="0" w:start="0" w:end="0"/>
-              <w:jc w:val="center"/>
+              </w:rPr>
+            </w:pPr>
+            <w:r>
               <w:rPr>
                 <w:rFonts w:ascii="Arial" w:hAnsi="Arial"/>
                 <w:sz w:val="20"/>
                 <w:szCs w:val="20"/>
-              </w:rPr>
-            </w:pPr>
-            <w:r>
-              <w:rPr>
-                <w:rFonts w:ascii="Arial" w:hAnsi="Arial"/>
-                <w:sz w:val="20"/>
-                <w:szCs w:val="20"/>
                 <w:lang w:val="en-US"/>
               </w:rPr>
               <w:t>Device</w:t>
@@ -4786,7 +4802,7 @@
         </w:tc>
         <w:tc>
           <w:tcPr>
-            <w:tcW w:w="885" w:type="dxa"/>
+            <w:tcW w:w="886" w:type="dxa"/>
             <w:tcBorders>
               <w:top w:val="double" w:sz="2" w:space="0" w:color="808080"/>
               <w:start w:val="double" w:sz="2" w:space="0" w:color="808080"/>
@@ -4954,20 +4970,13 @@
                 <w:rFonts w:ascii="Arial" w:hAnsi="Arial"/>
                 <w:lang w:val="en-US"/>
               </w:rPr>
-              <w:t xml:space="preserve">SCL </w:t>
-            </w:r>
-            <w:r>
-              <w:rPr>
-                <w:rFonts w:ascii="Arial" w:hAnsi="Arial"/>
-                <w:lang w:val="en-US"/>
-              </w:rPr>
-              <w:t>LAN</w:t>
-            </w:r>
-          </w:p>
-        </w:tc>
-        <w:tc>
-          <w:tcPr>
-            <w:tcW w:w="1710" w:type="dxa"/>
+              <w:t>SCL LAN</w:t>
+            </w:r>
+          </w:p>
+        </w:tc>
+        <w:tc>
+          <w:tcPr>
+            <w:tcW w:w="1709" w:type="dxa"/>
             <w:tcBorders>
               <w:start w:val="double" w:sz="2" w:space="0" w:color="808080"/>
               <w:bottom w:val="double" w:sz="2" w:space="0" w:color="808080"/>
@@ -5002,7 +5011,7 @@
         </w:tc>
         <w:tc>
           <w:tcPr>
-            <w:tcW w:w="885" w:type="dxa"/>
+            <w:tcW w:w="886" w:type="dxa"/>
             <w:tcBorders>
               <w:start w:val="double" w:sz="2" w:space="0" w:color="808080"/>
               <w:bottom w:val="double" w:sz="2" w:space="0" w:color="808080"/>
@@ -5174,7 +5183,7 @@
         </w:tc>
         <w:tc>
           <w:tcPr>
-            <w:tcW w:w="1710" w:type="dxa"/>
+            <w:tcW w:w="1709" w:type="dxa"/>
             <w:tcBorders>
               <w:start w:val="double" w:sz="2" w:space="0" w:color="808080"/>
               <w:bottom w:val="double" w:sz="2" w:space="0" w:color="808080"/>
@@ -5209,7 +5218,7 @@
         </w:tc>
         <w:tc>
           <w:tcPr>
-            <w:tcW w:w="885" w:type="dxa"/>
+            <w:tcW w:w="886" w:type="dxa"/>
             <w:tcBorders>
               <w:start w:val="double" w:sz="2" w:space="0" w:color="808080"/>
               <w:bottom w:val="double" w:sz="2" w:space="0" w:color="808080"/>
@@ -5374,7 +5383,7 @@
         </w:tc>
         <w:tc>
           <w:tcPr>
-            <w:tcW w:w="1710" w:type="dxa"/>
+            <w:tcW w:w="1709" w:type="dxa"/>
             <w:tcBorders>
               <w:start w:val="double" w:sz="2" w:space="0" w:color="808080"/>
               <w:bottom w:val="double" w:sz="2" w:space="0" w:color="808080"/>
@@ -5409,7 +5418,7 @@
         </w:tc>
         <w:tc>
           <w:tcPr>
-            <w:tcW w:w="885" w:type="dxa"/>
+            <w:tcW w:w="886" w:type="dxa"/>
             <w:tcBorders>
               <w:start w:val="double" w:sz="2" w:space="0" w:color="808080"/>
               <w:bottom w:val="double" w:sz="2" w:space="0" w:color="808080"/>
@@ -5574,7 +5583,7 @@
         </w:tc>
         <w:tc>
           <w:tcPr>
-            <w:tcW w:w="1710" w:type="dxa"/>
+            <w:tcW w:w="1709" w:type="dxa"/>
             <w:tcBorders>
               <w:start w:val="double" w:sz="2" w:space="0" w:color="808080"/>
               <w:bottom w:val="double" w:sz="2" w:space="0" w:color="808080"/>
@@ -5609,7 +5618,7 @@
         </w:tc>
         <w:tc>
           <w:tcPr>
-            <w:tcW w:w="885" w:type="dxa"/>
+            <w:tcW w:w="886" w:type="dxa"/>
             <w:tcBorders>
               <w:start w:val="double" w:sz="2" w:space="0" w:color="808080"/>
               <w:bottom w:val="double" w:sz="2" w:space="0" w:color="808080"/>
@@ -5774,7 +5783,7 @@
         </w:tc>
         <w:tc>
           <w:tcPr>
-            <w:tcW w:w="1710" w:type="dxa"/>
+            <w:tcW w:w="1709" w:type="dxa"/>
             <w:tcBorders>
               <w:start w:val="double" w:sz="2" w:space="0" w:color="808080"/>
               <w:bottom w:val="double" w:sz="2" w:space="0" w:color="808080"/>
@@ -5809,7 +5818,7 @@
         </w:tc>
         <w:tc>
           <w:tcPr>
-            <w:tcW w:w="885" w:type="dxa"/>
+            <w:tcW w:w="886" w:type="dxa"/>
             <w:tcBorders>
               <w:start w:val="double" w:sz="2" w:space="0" w:color="808080"/>
               <w:bottom w:val="double" w:sz="2" w:space="0" w:color="808080"/>
@@ -5974,7 +5983,7 @@
         </w:tc>
         <w:tc>
           <w:tcPr>
-            <w:tcW w:w="1710" w:type="dxa"/>
+            <w:tcW w:w="1709" w:type="dxa"/>
             <w:tcBorders>
               <w:start w:val="double" w:sz="2" w:space="0" w:color="808080"/>
               <w:bottom w:val="double" w:sz="2" w:space="0" w:color="808080"/>
@@ -6009,7 +6018,7 @@
         </w:tc>
         <w:tc>
           <w:tcPr>
-            <w:tcW w:w="885" w:type="dxa"/>
+            <w:tcW w:w="886" w:type="dxa"/>
             <w:tcBorders>
               <w:start w:val="double" w:sz="2" w:space="0" w:color="808080"/>
               <w:bottom w:val="double" w:sz="2" w:space="0" w:color="808080"/>
@@ -6174,7 +6183,7 @@
         </w:tc>
         <w:tc>
           <w:tcPr>
-            <w:tcW w:w="1710" w:type="dxa"/>
+            <w:tcW w:w="1709" w:type="dxa"/>
             <w:tcBorders>
               <w:start w:val="double" w:sz="2" w:space="0" w:color="808080"/>
               <w:bottom w:val="double" w:sz="2" w:space="0" w:color="808080"/>
@@ -6209,7 +6218,7 @@
         </w:tc>
         <w:tc>
           <w:tcPr>
-            <w:tcW w:w="885" w:type="dxa"/>
+            <w:tcW w:w="886" w:type="dxa"/>
             <w:tcBorders>
               <w:start w:val="double" w:sz="2" w:space="0" w:color="808080"/>
               <w:bottom w:val="double" w:sz="2" w:space="0" w:color="808080"/>
@@ -6374,7 +6383,7 @@
         </w:tc>
         <w:tc>
           <w:tcPr>
-            <w:tcW w:w="1710" w:type="dxa"/>
+            <w:tcW w:w="1709" w:type="dxa"/>
             <w:tcBorders>
               <w:start w:val="double" w:sz="2" w:space="0" w:color="808080"/>
               <w:bottom w:val="double" w:sz="2" w:space="0" w:color="808080"/>
@@ -6409,7 +6418,7 @@
         </w:tc>
         <w:tc>
           <w:tcPr>
-            <w:tcW w:w="885" w:type="dxa"/>
+            <w:tcW w:w="886" w:type="dxa"/>
             <w:tcBorders>
               <w:start w:val="double" w:sz="2" w:space="0" w:color="808080"/>
               <w:bottom w:val="double" w:sz="2" w:space="0" w:color="808080"/>
@@ -6570,20 +6579,13 @@
                 <w:rFonts w:ascii="Arial" w:hAnsi="Arial"/>
                 <w:lang w:val="en-US"/>
               </w:rPr>
-              <w:t xml:space="preserve">RMU </w:t>
-            </w:r>
-            <w:r>
-              <w:rPr>
-                <w:rFonts w:ascii="Arial" w:hAnsi="Arial"/>
-                <w:lang w:val="en-US"/>
-              </w:rPr>
-              <w:t>LAN</w:t>
-            </w:r>
-          </w:p>
-        </w:tc>
-        <w:tc>
-          <w:tcPr>
-            <w:tcW w:w="1710" w:type="dxa"/>
+              <w:t>RMU LAN</w:t>
+            </w:r>
+          </w:p>
+        </w:tc>
+        <w:tc>
+          <w:tcPr>
+            <w:tcW w:w="1709" w:type="dxa"/>
             <w:tcBorders>
               <w:start w:val="double" w:sz="2" w:space="0" w:color="808080"/>
               <w:bottom w:val="double" w:sz="2" w:space="0" w:color="808080"/>
@@ -6618,7 +6620,7 @@
         </w:tc>
         <w:tc>
           <w:tcPr>
-            <w:tcW w:w="885" w:type="dxa"/>
+            <w:tcW w:w="886" w:type="dxa"/>
             <w:tcBorders>
               <w:start w:val="double" w:sz="2" w:space="0" w:color="808080"/>
               <w:bottom w:val="double" w:sz="2" w:space="0" w:color="808080"/>
@@ -6782,7 +6784,7 @@
         </w:tc>
         <w:tc>
           <w:tcPr>
-            <w:tcW w:w="1710" w:type="dxa"/>
+            <w:tcW w:w="1709" w:type="dxa"/>
             <w:tcBorders>
               <w:start w:val="double" w:sz="2" w:space="0" w:color="808080"/>
               <w:bottom w:val="double" w:sz="2" w:space="0" w:color="808080"/>
@@ -6817,7 +6819,7 @@
         </w:tc>
         <w:tc>
           <w:tcPr>
-            <w:tcW w:w="885" w:type="dxa"/>
+            <w:tcW w:w="886" w:type="dxa"/>
             <w:tcBorders>
               <w:start w:val="double" w:sz="2" w:space="0" w:color="808080"/>
               <w:bottom w:val="double" w:sz="2" w:space="0" w:color="808080"/>
@@ -6981,7 +6983,7 @@
         </w:tc>
         <w:tc>
           <w:tcPr>
-            <w:tcW w:w="1710" w:type="dxa"/>
+            <w:tcW w:w="1709" w:type="dxa"/>
             <w:tcBorders>
               <w:start w:val="double" w:sz="2" w:space="0" w:color="808080"/>
               <w:bottom w:val="double" w:sz="2" w:space="0" w:color="808080"/>
@@ -7016,7 +7018,7 @@
         </w:tc>
         <w:tc>
           <w:tcPr>
-            <w:tcW w:w="885" w:type="dxa"/>
+            <w:tcW w:w="886" w:type="dxa"/>
             <w:tcBorders>
               <w:start w:val="double" w:sz="2" w:space="0" w:color="808080"/>
               <w:bottom w:val="double" w:sz="2" w:space="0" w:color="808080"/>
@@ -7182,7 +7184,7 @@
         </w:tc>
         <w:tc>
           <w:tcPr>
-            <w:tcW w:w="1710" w:type="dxa"/>
+            <w:tcW w:w="1709" w:type="dxa"/>
             <w:tcBorders>
               <w:start w:val="double" w:sz="2" w:space="0" w:color="808080"/>
               <w:bottom w:val="double" w:sz="2" w:space="0" w:color="808080"/>
@@ -7217,7 +7219,7 @@
         </w:tc>
         <w:tc>
           <w:tcPr>
-            <w:tcW w:w="885" w:type="dxa"/>
+            <w:tcW w:w="886" w:type="dxa"/>
             <w:tcBorders>
               <w:start w:val="double" w:sz="2" w:space="0" w:color="808080"/>
               <w:bottom w:val="double" w:sz="2" w:space="0" w:color="808080"/>
@@ -7378,20 +7380,13 @@
                 <w:rFonts w:ascii="Arial" w:hAnsi="Arial"/>
                 <w:lang w:val="en-US"/>
               </w:rPr>
-              <w:t xml:space="preserve">DBG </w:t>
-            </w:r>
-            <w:r>
-              <w:rPr>
-                <w:rFonts w:ascii="Arial" w:hAnsi="Arial"/>
-                <w:lang w:val="en-US"/>
-              </w:rPr>
-              <w:t>LAN</w:t>
-            </w:r>
-          </w:p>
-        </w:tc>
-        <w:tc>
-          <w:tcPr>
-            <w:tcW w:w="1710" w:type="dxa"/>
+              <w:t>DBG LAN</w:t>
+            </w:r>
+          </w:p>
+        </w:tc>
+        <w:tc>
+          <w:tcPr>
+            <w:tcW w:w="1709" w:type="dxa"/>
             <w:tcBorders>
               <w:start w:val="double" w:sz="2" w:space="0" w:color="808080"/>
               <w:bottom w:val="double" w:sz="2" w:space="0" w:color="808080"/>
@@ -7426,7 +7421,7 @@
         </w:tc>
         <w:tc>
           <w:tcPr>
-            <w:tcW w:w="885" w:type="dxa"/>
+            <w:tcW w:w="886" w:type="dxa"/>
             <w:tcBorders>
               <w:start w:val="double" w:sz="2" w:space="0" w:color="808080"/>
               <w:bottom w:val="double" w:sz="2" w:space="0" w:color="808080"/>
@@ -7590,7 +7585,7 @@
         </w:tc>
         <w:tc>
           <w:tcPr>
-            <w:tcW w:w="1710" w:type="dxa"/>
+            <w:tcW w:w="1709" w:type="dxa"/>
             <w:tcBorders>
               <w:start w:val="double" w:sz="2" w:space="0" w:color="808080"/>
               <w:bottom w:val="double" w:sz="2" w:space="0" w:color="808080"/>
@@ -7625,7 +7620,7 @@
         </w:tc>
         <w:tc>
           <w:tcPr>
-            <w:tcW w:w="885" w:type="dxa"/>
+            <w:tcW w:w="886" w:type="dxa"/>
             <w:tcBorders>
               <w:start w:val="double" w:sz="2" w:space="0" w:color="808080"/>
               <w:bottom w:val="double" w:sz="2" w:space="0" w:color="808080"/>
@@ -7789,7 +7784,7 @@
         </w:tc>
         <w:tc>
           <w:tcPr>
-            <w:tcW w:w="1710" w:type="dxa"/>
+            <w:tcW w:w="1709" w:type="dxa"/>
             <w:tcBorders>
               <w:start w:val="double" w:sz="2" w:space="0" w:color="808080"/>
               <w:bottom w:val="double" w:sz="2" w:space="0" w:color="808080"/>
@@ -7824,7 +7819,7 @@
         </w:tc>
         <w:tc>
           <w:tcPr>
-            <w:tcW w:w="885" w:type="dxa"/>
+            <w:tcW w:w="886" w:type="dxa"/>
             <w:tcBorders>
               <w:start w:val="double" w:sz="2" w:space="0" w:color="808080"/>
               <w:bottom w:val="double" w:sz="2" w:space="0" w:color="808080"/>
@@ -7988,7 +7983,7 @@
         </w:tc>
         <w:tc>
           <w:tcPr>
-            <w:tcW w:w="1710" w:type="dxa"/>
+            <w:tcW w:w="1709" w:type="dxa"/>
             <w:tcBorders>
               <w:start w:val="double" w:sz="2" w:space="0" w:color="808080"/>
               <w:bottom w:val="double" w:sz="2" w:space="0" w:color="808080"/>
@@ -8023,7 +8018,7 @@
         </w:tc>
         <w:tc>
           <w:tcPr>
-            <w:tcW w:w="885" w:type="dxa"/>
+            <w:tcW w:w="886" w:type="dxa"/>
             <w:tcBorders>
               <w:start w:val="double" w:sz="2" w:space="0" w:color="808080"/>
               <w:bottom w:val="double" w:sz="2" w:space="0" w:color="808080"/>
@@ -8184,20 +8179,13 @@
                 <w:rFonts w:ascii="Arial" w:hAnsi="Arial"/>
                 <w:lang w:val="en-US"/>
               </w:rPr>
-              <w:t xml:space="preserve">MDU </w:t>
-            </w:r>
-            <w:r>
-              <w:rPr>
-                <w:rFonts w:ascii="Arial" w:hAnsi="Arial"/>
-                <w:lang w:val="en-US"/>
-              </w:rPr>
-              <w:t>LAN</w:t>
-            </w:r>
-          </w:p>
-        </w:tc>
-        <w:tc>
-          <w:tcPr>
-            <w:tcW w:w="1710" w:type="dxa"/>
+              <w:t>MDU LAN</w:t>
+            </w:r>
+          </w:p>
+        </w:tc>
+        <w:tc>
+          <w:tcPr>
+            <w:tcW w:w="1709" w:type="dxa"/>
             <w:tcBorders>
               <w:start w:val="double" w:sz="2" w:space="0" w:color="808080"/>
               <w:bottom w:val="double" w:sz="2" w:space="0" w:color="808080"/>
@@ -8232,7 +8220,7 @@
         </w:tc>
         <w:tc>
           <w:tcPr>
-            <w:tcW w:w="885" w:type="dxa"/>
+            <w:tcW w:w="886" w:type="dxa"/>
             <w:tcBorders>
               <w:start w:val="double" w:sz="2" w:space="0" w:color="808080"/>
               <w:bottom w:val="double" w:sz="2" w:space="0" w:color="808080"/>
@@ -8396,7 +8384,7 @@
         </w:tc>
         <w:tc>
           <w:tcPr>
-            <w:tcW w:w="1710" w:type="dxa"/>
+            <w:tcW w:w="1709" w:type="dxa"/>
             <w:tcBorders>
               <w:start w:val="double" w:sz="2" w:space="0" w:color="808080"/>
               <w:bottom w:val="double" w:sz="2" w:space="0" w:color="808080"/>
@@ -8431,7 +8419,7 @@
         </w:tc>
         <w:tc>
           <w:tcPr>
-            <w:tcW w:w="885" w:type="dxa"/>
+            <w:tcW w:w="886" w:type="dxa"/>
             <w:tcBorders>
               <w:start w:val="double" w:sz="2" w:space="0" w:color="808080"/>
               <w:bottom w:val="double" w:sz="2" w:space="0" w:color="808080"/>
@@ -8595,7 +8583,7 @@
         </w:tc>
         <w:tc>
           <w:tcPr>
-            <w:tcW w:w="1710" w:type="dxa"/>
+            <w:tcW w:w="1709" w:type="dxa"/>
             <w:tcBorders>
               <w:start w:val="double" w:sz="2" w:space="0" w:color="808080"/>
               <w:bottom w:val="double" w:sz="2" w:space="0" w:color="808080"/>
@@ -8630,7 +8618,7 @@
         </w:tc>
         <w:tc>
           <w:tcPr>
-            <w:tcW w:w="885" w:type="dxa"/>
+            <w:tcW w:w="886" w:type="dxa"/>
             <w:tcBorders>
               <w:start w:val="double" w:sz="2" w:space="0" w:color="808080"/>
               <w:bottom w:val="double" w:sz="2" w:space="0" w:color="808080"/>
@@ -8794,7 +8782,7 @@
         </w:tc>
         <w:tc>
           <w:tcPr>
-            <w:tcW w:w="1710" w:type="dxa"/>
+            <w:tcW w:w="1709" w:type="dxa"/>
             <w:tcBorders>
               <w:start w:val="double" w:sz="2" w:space="0" w:color="808080"/>
               <w:bottom w:val="double" w:sz="2" w:space="0" w:color="808080"/>
@@ -8829,7 +8817,7 @@
         </w:tc>
         <w:tc>
           <w:tcPr>
-            <w:tcW w:w="885" w:type="dxa"/>
+            <w:tcW w:w="886" w:type="dxa"/>
             <w:tcBorders>
               <w:start w:val="double" w:sz="2" w:space="0" w:color="808080"/>
               <w:bottom w:val="double" w:sz="2" w:space="0" w:color="808080"/>
@@ -8993,7 +8981,7 @@
         </w:tc>
         <w:tc>
           <w:tcPr>
-            <w:tcW w:w="1710" w:type="dxa"/>
+            <w:tcW w:w="1709" w:type="dxa"/>
             <w:tcBorders>
               <w:start w:val="double" w:sz="2" w:space="0" w:color="808080"/>
               <w:bottom w:val="double" w:sz="2" w:space="0" w:color="808080"/>
@@ -9028,7 +9016,7 @@
         </w:tc>
         <w:tc>
           <w:tcPr>
-            <w:tcW w:w="885" w:type="dxa"/>
+            <w:tcW w:w="886" w:type="dxa"/>
             <w:tcBorders>
               <w:start w:val="double" w:sz="2" w:space="0" w:color="808080"/>
               <w:bottom w:val="double" w:sz="2" w:space="0" w:color="808080"/>
@@ -9192,7 +9180,7 @@
         </w:tc>
         <w:tc>
           <w:tcPr>
-            <w:tcW w:w="1710" w:type="dxa"/>
+            <w:tcW w:w="1709" w:type="dxa"/>
             <w:tcBorders>
               <w:start w:val="double" w:sz="2" w:space="0" w:color="808080"/>
               <w:bottom w:val="double" w:sz="2" w:space="0" w:color="808080"/>
@@ -9227,7 +9215,7 @@
         </w:tc>
         <w:tc>
           <w:tcPr>
-            <w:tcW w:w="885" w:type="dxa"/>
+            <w:tcW w:w="886" w:type="dxa"/>
             <w:tcBorders>
               <w:start w:val="double" w:sz="2" w:space="0" w:color="808080"/>
               <w:bottom w:val="double" w:sz="2" w:space="0" w:color="808080"/>
@@ -9388,20 +9376,13 @@
                 <w:rFonts w:ascii="Arial" w:hAnsi="Arial"/>
                 <w:lang w:val="en-US"/>
               </w:rPr>
-              <w:t xml:space="preserve">GVU </w:t>
-            </w:r>
-            <w:r>
-              <w:rPr>
-                <w:rFonts w:ascii="Arial" w:hAnsi="Arial"/>
-                <w:lang w:val="en-US"/>
-              </w:rPr>
-              <w:t>LAN</w:t>
-            </w:r>
-          </w:p>
-        </w:tc>
-        <w:tc>
-          <w:tcPr>
-            <w:tcW w:w="1710" w:type="dxa"/>
+              <w:t>GVU LAN</w:t>
+            </w:r>
+          </w:p>
+        </w:tc>
+        <w:tc>
+          <w:tcPr>
+            <w:tcW w:w="1709" w:type="dxa"/>
             <w:tcBorders>
               <w:start w:val="double" w:sz="2" w:space="0" w:color="808080"/>
               <w:bottom w:val="double" w:sz="2" w:space="0" w:color="808080"/>
@@ -9436,7 +9417,7 @@
         </w:tc>
         <w:tc>
           <w:tcPr>
-            <w:tcW w:w="885" w:type="dxa"/>
+            <w:tcW w:w="886" w:type="dxa"/>
             <w:tcBorders>
               <w:start w:val="double" w:sz="2" w:space="0" w:color="808080"/>
               <w:bottom w:val="double" w:sz="2" w:space="0" w:color="808080"/>
@@ -9601,7 +9582,7 @@
         </w:tc>
         <w:tc>
           <w:tcPr>
-            <w:tcW w:w="1710" w:type="dxa"/>
+            <w:tcW w:w="1709" w:type="dxa"/>
             <w:tcBorders>
               <w:start w:val="double" w:sz="2" w:space="0" w:color="808080"/>
               <w:bottom w:val="double" w:sz="2" w:space="0" w:color="808080"/>
@@ -9636,7 +9617,7 @@
         </w:tc>
         <w:tc>
           <w:tcPr>
-            <w:tcW w:w="885" w:type="dxa"/>
+            <w:tcW w:w="886" w:type="dxa"/>
             <w:tcBorders>
               <w:start w:val="double" w:sz="2" w:space="0" w:color="808080"/>
               <w:bottom w:val="double" w:sz="2" w:space="0" w:color="808080"/>
@@ -9801,7 +9782,7 @@
         </w:tc>
         <w:tc>
           <w:tcPr>
-            <w:tcW w:w="1710" w:type="dxa"/>
+            <w:tcW w:w="1709" w:type="dxa"/>
             <w:tcBorders>
               <w:start w:val="double" w:sz="2" w:space="0" w:color="808080"/>
               <w:bottom w:val="double" w:sz="2" w:space="0" w:color="808080"/>
@@ -9836,7 +9817,7 @@
         </w:tc>
         <w:tc>
           <w:tcPr>
-            <w:tcW w:w="885" w:type="dxa"/>
+            <w:tcW w:w="886" w:type="dxa"/>
             <w:tcBorders>
               <w:start w:val="double" w:sz="2" w:space="0" w:color="808080"/>
               <w:bottom w:val="double" w:sz="2" w:space="0" w:color="808080"/>
@@ -10001,7 +9982,7 @@
         </w:tc>
         <w:tc>
           <w:tcPr>
-            <w:tcW w:w="1710" w:type="dxa"/>
+            <w:tcW w:w="1709" w:type="dxa"/>
             <w:tcBorders>
               <w:start w:val="double" w:sz="2" w:space="0" w:color="808080"/>
               <w:bottom w:val="double" w:sz="2" w:space="0" w:color="808080"/>
@@ -10036,7 +10017,7 @@
         </w:tc>
         <w:tc>
           <w:tcPr>
-            <w:tcW w:w="885" w:type="dxa"/>
+            <w:tcW w:w="886" w:type="dxa"/>
             <w:tcBorders>
               <w:start w:val="double" w:sz="2" w:space="0" w:color="808080"/>
               <w:bottom w:val="double" w:sz="2" w:space="0" w:color="808080"/>
@@ -10197,20 +10178,13 @@
                 <w:rFonts w:ascii="Arial" w:hAnsi="Arial"/>
                 <w:lang w:val="en-US"/>
               </w:rPr>
-              <w:t xml:space="preserve">ASN </w:t>
-            </w:r>
-            <w:r>
-              <w:rPr>
-                <w:rFonts w:ascii="Arial" w:hAnsi="Arial"/>
-                <w:lang w:val="en-US"/>
-              </w:rPr>
-              <w:t>LAN</w:t>
-            </w:r>
-          </w:p>
-        </w:tc>
-        <w:tc>
-          <w:tcPr>
-            <w:tcW w:w="1710" w:type="dxa"/>
+              <w:t>ASN LAN</w:t>
+            </w:r>
+          </w:p>
+        </w:tc>
+        <w:tc>
+          <w:tcPr>
+            <w:tcW w:w="1709" w:type="dxa"/>
             <w:tcBorders>
               <w:start w:val="double" w:sz="2" w:space="0" w:color="808080"/>
               <w:bottom w:val="double" w:sz="2" w:space="0" w:color="808080"/>
@@ -10245,7 +10219,7 @@
         </w:tc>
         <w:tc>
           <w:tcPr>
-            <w:tcW w:w="885" w:type="dxa"/>
+            <w:tcW w:w="886" w:type="dxa"/>
             <w:tcBorders>
               <w:start w:val="double" w:sz="2" w:space="0" w:color="808080"/>
               <w:bottom w:val="double" w:sz="2" w:space="0" w:color="808080"/>
@@ -10409,7 +10383,7 @@
         </w:tc>
         <w:tc>
           <w:tcPr>
-            <w:tcW w:w="1710" w:type="dxa"/>
+            <w:tcW w:w="1709" w:type="dxa"/>
             <w:tcBorders>
               <w:start w:val="double" w:sz="2" w:space="0" w:color="808080"/>
               <w:bottom w:val="double" w:sz="2" w:space="0" w:color="808080"/>
@@ -10444,7 +10418,7 @@
         </w:tc>
         <w:tc>
           <w:tcPr>
-            <w:tcW w:w="885" w:type="dxa"/>
+            <w:tcW w:w="886" w:type="dxa"/>
             <w:tcBorders>
               <w:start w:val="double" w:sz="2" w:space="0" w:color="808080"/>
               <w:bottom w:val="double" w:sz="2" w:space="0" w:color="808080"/>
@@ -10608,7 +10582,7 @@
         </w:tc>
         <w:tc>
           <w:tcPr>
-            <w:tcW w:w="1710" w:type="dxa"/>
+            <w:tcW w:w="1709" w:type="dxa"/>
             <w:tcBorders>
               <w:start w:val="double" w:sz="2" w:space="0" w:color="808080"/>
               <w:bottom w:val="double" w:sz="2" w:space="0" w:color="808080"/>
@@ -10643,7 +10617,7 @@
         </w:tc>
         <w:tc>
           <w:tcPr>
-            <w:tcW w:w="885" w:type="dxa"/>
+            <w:tcW w:w="886" w:type="dxa"/>
             <w:tcBorders>
               <w:start w:val="double" w:sz="2" w:space="0" w:color="808080"/>
               <w:bottom w:val="double" w:sz="2" w:space="0" w:color="808080"/>
@@ -10807,7 +10781,7 @@
         </w:tc>
         <w:tc>
           <w:tcPr>
-            <w:tcW w:w="1710" w:type="dxa"/>
+            <w:tcW w:w="1709" w:type="dxa"/>
             <w:tcBorders>
               <w:start w:val="double" w:sz="2" w:space="0" w:color="808080"/>
               <w:bottom w:val="double" w:sz="2" w:space="0" w:color="808080"/>
@@ -10842,7 +10816,7 @@
         </w:tc>
         <w:tc>
           <w:tcPr>
-            <w:tcW w:w="885" w:type="dxa"/>
+            <w:tcW w:w="886" w:type="dxa"/>
             <w:tcBorders>
               <w:start w:val="double" w:sz="2" w:space="0" w:color="808080"/>
               <w:bottom w:val="double" w:sz="2" w:space="0" w:color="808080"/>
@@ -11006,35 +10980,35 @@
         </w:tc>
         <w:tc>
           <w:tcPr>
-            <w:tcW w:w="1710" w:type="dxa"/>
-            <w:tcBorders>
-              <w:start w:val="double" w:sz="2" w:space="0" w:color="808080"/>
-              <w:bottom w:val="double" w:sz="2" w:space="0" w:color="808080"/>
-              <w:end w:val="double" w:sz="2" w:space="0" w:color="808080"/>
-            </w:tcBorders>
-            <w:vAlign w:val="center"/>
-          </w:tcPr>
-          <w:p>
-            <w:pPr>
-              <w:pStyle w:val="TableContents"/>
-              <w:widowControl/>
-              <w:spacing w:before="0" w:after="283"/>
-              <w:ind w:hanging="0" w:start="0" w:end="0"/>
-              <w:rPr>
-                <w:rFonts w:ascii="Arial" w:hAnsi="Arial"/>
-              </w:rPr>
-            </w:pPr>
-            <w:r>
-              <w:rPr>
-                <w:rFonts w:ascii="Arial" w:hAnsi="Arial"/>
-              </w:rPr>
-              <w:t> </w:t>
-            </w:r>
-          </w:p>
-        </w:tc>
-        <w:tc>
-          <w:tcPr>
-            <w:tcW w:w="885" w:type="dxa"/>
+            <w:tcW w:w="1709" w:type="dxa"/>
+            <w:tcBorders>
+              <w:start w:val="double" w:sz="2" w:space="0" w:color="808080"/>
+              <w:bottom w:val="double" w:sz="2" w:space="0" w:color="808080"/>
+              <w:end w:val="double" w:sz="2" w:space="0" w:color="808080"/>
+            </w:tcBorders>
+            <w:vAlign w:val="center"/>
+          </w:tcPr>
+          <w:p>
+            <w:pPr>
+              <w:pStyle w:val="TableContents"/>
+              <w:widowControl/>
+              <w:spacing w:before="0" w:after="283"/>
+              <w:ind w:hanging="0" w:start="0" w:end="0"/>
+              <w:rPr>
+                <w:rFonts w:ascii="Arial" w:hAnsi="Arial"/>
+              </w:rPr>
+            </w:pPr>
+            <w:r>
+              <w:rPr>
+                <w:rFonts w:ascii="Arial" w:hAnsi="Arial"/>
+              </w:rPr>
+              <w:t> </w:t>
+            </w:r>
+          </w:p>
+        </w:tc>
+        <w:tc>
+          <w:tcPr>
+            <w:tcW w:w="886" w:type="dxa"/>
             <w:tcBorders>
               <w:start w:val="double" w:sz="2" w:space="0" w:color="808080"/>
               <w:bottom w:val="double" w:sz="2" w:space="0" w:color="808080"/>
@@ -11179,35 +11153,35 @@
         </w:tc>
         <w:tc>
           <w:tcPr>
-            <w:tcW w:w="1710" w:type="dxa"/>
-            <w:tcBorders>
-              <w:start w:val="double" w:sz="2" w:space="0" w:color="808080"/>
-              <w:bottom w:val="double" w:sz="2" w:space="0" w:color="808080"/>
-              <w:end w:val="double" w:sz="2" w:space="0" w:color="808080"/>
-            </w:tcBorders>
-            <w:vAlign w:val="center"/>
-          </w:tcPr>
-          <w:p>
-            <w:pPr>
-              <w:pStyle w:val="TableContents"/>
-              <w:widowControl/>
-              <w:spacing w:before="0" w:after="283"/>
-              <w:ind w:hanging="0" w:start="0" w:end="0"/>
-              <w:rPr>
-                <w:rFonts w:ascii="Arial" w:hAnsi="Arial"/>
-              </w:rPr>
-            </w:pPr>
-            <w:r>
-              <w:rPr>
-                <w:rFonts w:ascii="Arial" w:hAnsi="Arial"/>
-              </w:rPr>
-              <w:t> </w:t>
-            </w:r>
-          </w:p>
-        </w:tc>
-        <w:tc>
-          <w:tcPr>
-            <w:tcW w:w="885" w:type="dxa"/>
+            <w:tcW w:w="1709" w:type="dxa"/>
+            <w:tcBorders>
+              <w:start w:val="double" w:sz="2" w:space="0" w:color="808080"/>
+              <w:bottom w:val="double" w:sz="2" w:space="0" w:color="808080"/>
+              <w:end w:val="double" w:sz="2" w:space="0" w:color="808080"/>
+            </w:tcBorders>
+            <w:vAlign w:val="center"/>
+          </w:tcPr>
+          <w:p>
+            <w:pPr>
+              <w:pStyle w:val="TableContents"/>
+              <w:widowControl/>
+              <w:spacing w:before="0" w:after="283"/>
+              <w:ind w:hanging="0" w:start="0" w:end="0"/>
+              <w:rPr>
+                <w:rFonts w:ascii="Arial" w:hAnsi="Arial"/>
+              </w:rPr>
+            </w:pPr>
+            <w:r>
+              <w:rPr>
+                <w:rFonts w:ascii="Arial" w:hAnsi="Arial"/>
+              </w:rPr>
+              <w:t> </w:t>
+            </w:r>
+          </w:p>
+        </w:tc>
+        <w:tc>
+          <w:tcPr>
+            <w:tcW w:w="886" w:type="dxa"/>
             <w:tcBorders>
               <w:start w:val="double" w:sz="2" w:space="0" w:color="808080"/>
               <w:bottom w:val="double" w:sz="2" w:space="0" w:color="808080"/>
@@ -11347,27 +11321,13 @@
                 <w:rFonts w:ascii="Arial" w:hAnsi="Arial"/>
                 <w:lang w:val="en-US"/>
               </w:rPr>
-              <w:t>Back</w:t>
-            </w:r>
-            <w:r>
-              <w:rPr>
-                <w:rFonts w:ascii="Arial" w:hAnsi="Arial"/>
-                <w:lang w:val="en-US"/>
-              </w:rPr>
-              <w:t>b</w:t>
-            </w:r>
-            <w:r>
-              <w:rPr>
-                <w:rFonts w:ascii="Arial" w:hAnsi="Arial"/>
-                <w:lang w:val="en-US"/>
-              </w:rPr>
-              <w:t>one IP address</w:t>
-            </w:r>
-          </w:p>
-        </w:tc>
-        <w:tc>
-          <w:tcPr>
-            <w:tcW w:w="1710" w:type="dxa"/>
+              <w:t>Backbone IP address</w:t>
+            </w:r>
+          </w:p>
+        </w:tc>
+        <w:tc>
+          <w:tcPr>
+            <w:tcW w:w="1709" w:type="dxa"/>
             <w:tcBorders>
               <w:start w:val="double" w:sz="2" w:space="0" w:color="808080"/>
               <w:bottom w:val="double" w:sz="2" w:space="0" w:color="808080"/>
@@ -11402,7 +11362,7 @@
         </w:tc>
         <w:tc>
           <w:tcPr>
-            <w:tcW w:w="885" w:type="dxa"/>
+            <w:tcW w:w="886" w:type="dxa"/>
             <w:tcBorders>
               <w:start w:val="double" w:sz="2" w:space="0" w:color="808080"/>
               <w:bottom w:val="double" w:sz="2" w:space="0" w:color="808080"/>
@@ -11566,7 +11526,7 @@
         </w:tc>
         <w:tc>
           <w:tcPr>
-            <w:tcW w:w="1710" w:type="dxa"/>
+            <w:tcW w:w="1709" w:type="dxa"/>
             <w:tcBorders>
               <w:start w:val="double" w:sz="2" w:space="0" w:color="808080"/>
               <w:bottom w:val="double" w:sz="2" w:space="0" w:color="808080"/>
@@ -11601,7 +11561,7 @@
         </w:tc>
         <w:tc>
           <w:tcPr>
-            <w:tcW w:w="885" w:type="dxa"/>
+            <w:tcW w:w="886" w:type="dxa"/>
             <w:tcBorders>
               <w:start w:val="double" w:sz="2" w:space="0" w:color="808080"/>
               <w:bottom w:val="double" w:sz="2" w:space="0" w:color="808080"/>
@@ -11765,7 +11725,7 @@
         </w:tc>
         <w:tc>
           <w:tcPr>
-            <w:tcW w:w="1710" w:type="dxa"/>
+            <w:tcW w:w="1709" w:type="dxa"/>
             <w:tcBorders>
               <w:start w:val="double" w:sz="2" w:space="0" w:color="808080"/>
               <w:bottom w:val="double" w:sz="2" w:space="0" w:color="808080"/>
@@ -11800,7 +11760,7 @@
         </w:tc>
         <w:tc>
           <w:tcPr>
-            <w:tcW w:w="885" w:type="dxa"/>
+            <w:tcW w:w="886" w:type="dxa"/>
             <w:tcBorders>
               <w:start w:val="double" w:sz="2" w:space="0" w:color="808080"/>
               <w:bottom w:val="double" w:sz="2" w:space="0" w:color="808080"/>
@@ -11971,7 +11931,7 @@
         </w:tc>
         <w:tc>
           <w:tcPr>
-            <w:tcW w:w="1710" w:type="dxa"/>
+            <w:tcW w:w="1709" w:type="dxa"/>
             <w:tcBorders>
               <w:start w:val="double" w:sz="2" w:space="0" w:color="808080"/>
               <w:bottom w:val="double" w:sz="2" w:space="0" w:color="808080"/>
@@ -12006,7 +11966,7 @@
         </w:tc>
         <w:tc>
           <w:tcPr>
-            <w:tcW w:w="885" w:type="dxa"/>
+            <w:tcW w:w="886" w:type="dxa"/>
             <w:tcBorders>
               <w:start w:val="double" w:sz="2" w:space="0" w:color="808080"/>
               <w:bottom w:val="double" w:sz="2" w:space="0" w:color="808080"/>
@@ -12170,7 +12130,7 @@
         </w:tc>
         <w:tc>
           <w:tcPr>
-            <w:tcW w:w="1710" w:type="dxa"/>
+            <w:tcW w:w="1709" w:type="dxa"/>
             <w:tcBorders>
               <w:start w:val="double" w:sz="2" w:space="0" w:color="808080"/>
               <w:bottom w:val="double" w:sz="2" w:space="0" w:color="808080"/>
@@ -12205,7 +12165,7 @@
         </w:tc>
         <w:tc>
           <w:tcPr>
-            <w:tcW w:w="885" w:type="dxa"/>
+            <w:tcW w:w="886" w:type="dxa"/>
             <w:tcBorders>
               <w:start w:val="double" w:sz="2" w:space="0" w:color="808080"/>
               <w:bottom w:val="double" w:sz="2" w:space="0" w:color="808080"/>
@@ -12376,7 +12336,7 @@
         </w:tc>
         <w:tc>
           <w:tcPr>
-            <w:tcW w:w="1710" w:type="dxa"/>
+            <w:tcW w:w="1709" w:type="dxa"/>
             <w:tcBorders>
               <w:start w:val="double" w:sz="2" w:space="0" w:color="808080"/>
               <w:bottom w:val="double" w:sz="2" w:space="0" w:color="808080"/>
@@ -12411,7 +12371,7 @@
         </w:tc>
         <w:tc>
           <w:tcPr>
-            <w:tcW w:w="885" w:type="dxa"/>
+            <w:tcW w:w="886" w:type="dxa"/>
             <w:tcBorders>
               <w:start w:val="double" w:sz="2" w:space="0" w:color="808080"/>
               <w:bottom w:val="double" w:sz="2" w:space="0" w:color="808080"/>
@@ -12575,7 +12535,7 @@
         </w:tc>
         <w:tc>
           <w:tcPr>
-            <w:tcW w:w="1710" w:type="dxa"/>
+            <w:tcW w:w="1709" w:type="dxa"/>
             <w:tcBorders>
               <w:start w:val="double" w:sz="2" w:space="0" w:color="808080"/>
               <w:bottom w:val="double" w:sz="2" w:space="0" w:color="808080"/>
@@ -12610,7 +12570,7 @@
         </w:tc>
         <w:tc>
           <w:tcPr>
-            <w:tcW w:w="885" w:type="dxa"/>
+            <w:tcW w:w="886" w:type="dxa"/>
             <w:tcBorders>
               <w:start w:val="double" w:sz="2" w:space="0" w:color="808080"/>
               <w:bottom w:val="double" w:sz="2" w:space="0" w:color="808080"/>
@@ -12781,7 +12741,7 @@
         </w:tc>
         <w:tc>
           <w:tcPr>
-            <w:tcW w:w="1710" w:type="dxa"/>
+            <w:tcW w:w="1709" w:type="dxa"/>
             <w:tcBorders>
               <w:start w:val="double" w:sz="2" w:space="0" w:color="808080"/>
               <w:bottom w:val="double" w:sz="2" w:space="0" w:color="808080"/>
@@ -12816,7 +12776,7 @@
         </w:tc>
         <w:tc>
           <w:tcPr>
-            <w:tcW w:w="885" w:type="dxa"/>
+            <w:tcW w:w="886" w:type="dxa"/>
             <w:tcBorders>
               <w:start w:val="double" w:sz="2" w:space="0" w:color="808080"/>
               <w:bottom w:val="double" w:sz="2" w:space="0" w:color="808080"/>
@@ -12980,7 +12940,7 @@
         </w:tc>
         <w:tc>
           <w:tcPr>
-            <w:tcW w:w="1710" w:type="dxa"/>
+            <w:tcW w:w="1709" w:type="dxa"/>
             <w:tcBorders>
               <w:start w:val="double" w:sz="2" w:space="0" w:color="808080"/>
               <w:bottom w:val="double" w:sz="2" w:space="0" w:color="808080"/>
@@ -13015,7 +12975,7 @@
         </w:tc>
         <w:tc>
           <w:tcPr>
-            <w:tcW w:w="885" w:type="dxa"/>
+            <w:tcW w:w="886" w:type="dxa"/>
             <w:tcBorders>
               <w:start w:val="double" w:sz="2" w:space="0" w:color="808080"/>
               <w:bottom w:val="double" w:sz="2" w:space="0" w:color="808080"/>
@@ -13186,7 +13146,7 @@
         </w:tc>
         <w:tc>
           <w:tcPr>
-            <w:tcW w:w="1710" w:type="dxa"/>
+            <w:tcW w:w="1709" w:type="dxa"/>
             <w:tcBorders>
               <w:start w:val="double" w:sz="2" w:space="0" w:color="808080"/>
               <w:bottom w:val="double" w:sz="2" w:space="0" w:color="808080"/>
@@ -13221,7 +13181,7 @@
         </w:tc>
         <w:tc>
           <w:tcPr>
-            <w:tcW w:w="885" w:type="dxa"/>
+            <w:tcW w:w="886" w:type="dxa"/>
             <w:tcBorders>
               <w:start w:val="double" w:sz="2" w:space="0" w:color="808080"/>
               <w:bottom w:val="double" w:sz="2" w:space="0" w:color="808080"/>
@@ -13385,7 +13345,7 @@
         </w:tc>
         <w:tc>
           <w:tcPr>
-            <w:tcW w:w="1710" w:type="dxa"/>
+            <w:tcW w:w="1709" w:type="dxa"/>
             <w:tcBorders>
               <w:start w:val="double" w:sz="2" w:space="0" w:color="808080"/>
               <w:bottom w:val="double" w:sz="2" w:space="0" w:color="808080"/>
@@ -13420,7 +13380,7 @@
         </w:tc>
         <w:tc>
           <w:tcPr>
-            <w:tcW w:w="885" w:type="dxa"/>
+            <w:tcW w:w="886" w:type="dxa"/>
             <w:tcBorders>
               <w:start w:val="double" w:sz="2" w:space="0" w:color="808080"/>
               <w:bottom w:val="double" w:sz="2" w:space="0" w:color="808080"/>
@@ -13591,7 +13551,7 @@
         </w:tc>
         <w:tc>
           <w:tcPr>
-            <w:tcW w:w="1710" w:type="dxa"/>
+            <w:tcW w:w="1709" w:type="dxa"/>
             <w:tcBorders>
               <w:start w:val="double" w:sz="2" w:space="0" w:color="808080"/>
               <w:bottom w:val="double" w:sz="2" w:space="0" w:color="808080"/>
@@ -13626,7 +13586,7 @@
         </w:tc>
         <w:tc>
           <w:tcPr>
-            <w:tcW w:w="885" w:type="dxa"/>
+            <w:tcW w:w="886" w:type="dxa"/>
             <w:tcBorders>
               <w:start w:val="double" w:sz="2" w:space="0" w:color="808080"/>
               <w:bottom w:val="double" w:sz="2" w:space="0" w:color="808080"/>
@@ -13790,7 +13750,7 @@
         </w:tc>
         <w:tc>
           <w:tcPr>
-            <w:tcW w:w="1710" w:type="dxa"/>
+            <w:tcW w:w="1709" w:type="dxa"/>
             <w:tcBorders>
               <w:start w:val="double" w:sz="2" w:space="0" w:color="808080"/>
               <w:bottom w:val="double" w:sz="2" w:space="0" w:color="808080"/>
@@ -13825,7 +13785,7 @@
         </w:tc>
         <w:tc>
           <w:tcPr>
-            <w:tcW w:w="885" w:type="dxa"/>
+            <w:tcW w:w="886" w:type="dxa"/>
             <w:tcBorders>
               <w:start w:val="double" w:sz="2" w:space="0" w:color="808080"/>
               <w:bottom w:val="double" w:sz="2" w:space="0" w:color="808080"/>
@@ -14020,7 +13980,7 @@
         </w:tc>
         <w:tc>
           <w:tcPr>
-            <w:tcW w:w="1710" w:type="dxa"/>
+            <w:tcW w:w="1709" w:type="dxa"/>
             <w:tcBorders>
               <w:start w:val="double" w:sz="2" w:space="0" w:color="808080"/>
               <w:bottom w:val="double" w:sz="2" w:space="0" w:color="808080"/>
@@ -14055,7 +14015,7 @@
         </w:tc>
         <w:tc>
           <w:tcPr>
-            <w:tcW w:w="885" w:type="dxa"/>
+            <w:tcW w:w="886" w:type="dxa"/>
             <w:tcBorders>
               <w:start w:val="double" w:sz="2" w:space="0" w:color="808080"/>
               <w:bottom w:val="double" w:sz="2" w:space="0" w:color="808080"/>
@@ -14219,7 +14179,7 @@
         </w:tc>
         <w:tc>
           <w:tcPr>
-            <w:tcW w:w="1710" w:type="dxa"/>
+            <w:tcW w:w="1709" w:type="dxa"/>
             <w:tcBorders>
               <w:start w:val="double" w:sz="2" w:space="0" w:color="808080"/>
               <w:bottom w:val="double" w:sz="2" w:space="0" w:color="808080"/>
@@ -14254,7 +14214,7 @@
         </w:tc>
         <w:tc>
           <w:tcPr>
-            <w:tcW w:w="885" w:type="dxa"/>
+            <w:tcW w:w="886" w:type="dxa"/>
             <w:tcBorders>
               <w:start w:val="double" w:sz="2" w:space="0" w:color="808080"/>
               <w:bottom w:val="double" w:sz="2" w:space="0" w:color="808080"/>
@@ -14661,7 +14621,6 @@
       <w:type w:val="continuous"/>
       <w:pgSz w:w="12240" w:h="15840"/>
       <w:pgMar w:left="1134" w:right="1134" w:gutter="0" w:header="0" w:top="1134" w:footer="0" w:bottom="1134"/>
-      <w:pgNumType w:fmt="decimal"/>
       <w:formProt w:val="false"/>
       <w:textDirection w:val="lrTb"/>
       <w:docGrid w:type="default" w:linePitch="100" w:charSpace="0"/>
@@ -15181,8 +15140,8 @@
       <w:szCs w:val="26"/>
     </w:rPr>
   </w:style>
-  <w:style w:type="character" w:styleId="Bulletsuser">
-    <w:name w:val="Bullets (user)"/>
+  <w:style w:type="character" w:styleId="Bullets">
+    <w:name w:val="Bullets"/>
     <w:qFormat/>
     <w:rPr>
       <w:rFonts w:ascii="OpenSymbol" w:hAnsi="OpenSymbol" w:eastAsia="OpenSymbol" w:cs="OpenSymbol"/>
@@ -15283,15 +15242,15 @@
       <w:szCs w:val="56"/>
     </w:rPr>
   </w:style>
-  <w:style w:type="paragraph" w:styleId="FrameContents">
-    <w:name w:val="Frame Contents"/>
+  <w:style w:type="paragraph" w:styleId="FrameContentsuser">
+    <w:name w:val="Frame Contents (user)"/>
     <w:basedOn w:val="Normal"/>
     <w:qFormat/>
     <w:pPr/>
     <w:rPr/>
   </w:style>
-  <w:style w:type="paragraph" w:styleId="FrameContentsuser">
-    <w:name w:val="Frame Contents (user)"/>
+  <w:style w:type="paragraph" w:styleId="FrameContents">
+    <w:name w:val="Frame Contents"/>
     <w:basedOn w:val="Normal"/>
     <w:qFormat/>
     <w:pPr/>

</xml_diff>